<commit_message>
v5.7 : Add architecture diagram to Section III and adjust PDF/DOCX generation parameters
- Included architecture diagram (image.png) in Section III of the generated documents.
- Adjusted PDF generation parameters to accommodate the new image while maintaining the target of exactly 6 pages.
- Updated styles for figure captions and ensured proper alignment in both PDF and DOCX outputs.
- Added new image file (image.png) and test PDF (test_6p.pdf) for verification.
</commit_message>
<xml_diff>
--- a/AgentShield_AI_6_Page_IEEE_Research_Paper.docx
+++ b/AgentShield_AI_6_Page_IEEE_Research_Paper.docx
@@ -208,6 +208,60 @@
           <w:sz w:val="18"/>
         </w:rPr>
         <w:t>III. SYSTEM ARCHITECTURE &amp; AGENT METHODOLOGY</w:t>
+      </w:r>
+    </w:p>
+    <w:p>
+      <w:pPr>
+        <w:jc w:val="center"/>
+      </w:pPr>
+    </w:p>
+    <w:p>
+      <w:r>
+        <w:drawing>
+          <wp:inline xmlns:a="http://schemas.openxmlformats.org/drawingml/2006/main" xmlns:pic="http://schemas.openxmlformats.org/drawingml/2006/picture">
+            <wp:extent cx="2926080" cy="1407831"/>
+            <wp:docPr id="1" name="Picture 1"/>
+            <wp:cNvGraphicFramePr>
+              <a:graphicFrameLocks noChangeAspect="1"/>
+            </wp:cNvGraphicFramePr>
+            <a:graphic>
+              <a:graphicData uri="http://schemas.openxmlformats.org/drawingml/2006/picture">
+                <pic:pic>
+                  <pic:nvPicPr>
+                    <pic:cNvPr id="0" name="image.png"/>
+                    <pic:cNvPicPr/>
+                  </pic:nvPicPr>
+                  <pic:blipFill>
+                    <a:blip r:embed="rId9"/>
+                    <a:stretch>
+                      <a:fillRect/>
+                    </a:stretch>
+                  </pic:blipFill>
+                  <pic:spPr>
+                    <a:xfrm>
+                      <a:off x="0" y="0"/>
+                      <a:ext cx="2926080" cy="1407831"/>
+                    </a:xfrm>
+                    <a:prstGeom prst="rect"/>
+                  </pic:spPr>
+                </pic:pic>
+              </a:graphicData>
+            </a:graphic>
+          </wp:inline>
+        </w:drawing>
+      </w:r>
+    </w:p>
+    <w:p>
+      <w:pPr>
+        <w:jc w:val="center"/>
+      </w:pPr>
+      <w:r>
+        <w:rPr>
+          <w:rFonts w:ascii="Times New Roman" w:hAnsi="Times New Roman"/>
+          <w:i/>
+          <w:sz w:val="15"/>
+        </w:rPr>
+        <w:t>Fig. 1. End-to-End System Architecture of AgentShield AI.</w:t>
       </w:r>
     </w:p>
     <w:p>

</xml_diff>

<commit_message>
v5.9 : Remove the complete implementation of the 12-page IEEE research paper generator script, including all associated imports, classes, and methods.
</commit_message>
<xml_diff>
--- a/AgentShield_AI_6_Page_IEEE_Research_Paper.docx
+++ b/AgentShield_AI_6_Page_IEEE_Research_Paper.docx
@@ -15,20 +15,233 @@
         <w:t>AgentShield AI: An Autonomous Multi-Agent Framework for Syntactic Verification, Secret Interception, and Sandbox-Validated Remediation in Multi-Cloud Infrastructure-as-Code</w:t>
       </w:r>
     </w:p>
+    <w:tbl>
+      <w:tblPr>
+        <w:tblW w:type="auto" w:w="0"/>
+        <w:jc w:val="center"/>
+        <w:tblLook w:firstColumn="1" w:firstRow="1" w:lastColumn="0" w:lastRow="0" w:noHBand="0" w:noVBand="1" w:val="04A0"/>
+      </w:tblPr>
+      <w:tblGrid>
+        <w:gridCol w:w="2700"/>
+        <w:gridCol w:w="2700"/>
+        <w:gridCol w:w="2700"/>
+        <w:gridCol w:w="2700"/>
+      </w:tblGrid>
+      <w:tr>
+        <w:tc>
+          <w:tcPr>
+            <w:tcW w:type="dxa" w:w="2664"/>
+          </w:tcPr>
+          <w:p>
+            <w:pPr>
+              <w:spacing w:before="0" w:after="20"/>
+              <w:jc w:val="center"/>
+            </w:pPr>
+            <w:r>
+              <w:rPr>
+                <w:rFonts w:ascii="Times New Roman" w:hAnsi="Times New Roman"/>
+                <w:b/>
+                <w:sz w:val="17"/>
+              </w:rPr>
+              <w:t>1st Anisha Paturi</w:t>
+            </w:r>
+          </w:p>
+          <w:p>
+            <w:pPr>
+              <w:spacing w:before="0" w:after="20"/>
+              <w:jc w:val="center"/>
+            </w:pPr>
+            <w:r>
+              <w:rPr>
+                <w:rFonts w:ascii="Times New Roman" w:hAnsi="Times New Roman"/>
+                <w:i/>
+                <w:sz w:val="14"/>
+              </w:rPr>
+              <w:t>Dept. of Computer Science &amp; Engg.</w:t>
+              <w:br/>
+              <w:t>Keshav Memorial Inst. of Tech.</w:t>
+              <w:br/>
+              <w:t>Hyderabad, Telangana, India</w:t>
+            </w:r>
+          </w:p>
+          <w:p>
+            <w:pPr>
+              <w:spacing w:before="0" w:after="40"/>
+              <w:jc w:val="center"/>
+            </w:pPr>
+            <w:r>
+              <w:rPr>
+                <w:rFonts w:ascii="Times New Roman" w:hAnsi="Times New Roman"/>
+                <w:sz w:val="14"/>
+              </w:rPr>
+              <w:t>paturi.anisha@gmail.com</w:t>
+            </w:r>
+          </w:p>
+        </w:tc>
+        <w:tc>
+          <w:tcPr>
+            <w:tcW w:type="dxa" w:w="2664"/>
+          </w:tcPr>
+          <w:p>
+            <w:pPr>
+              <w:spacing w:before="0" w:after="20"/>
+              <w:jc w:val="center"/>
+            </w:pPr>
+            <w:r>
+              <w:rPr>
+                <w:rFonts w:ascii="Times New Roman" w:hAnsi="Times New Roman"/>
+                <w:b/>
+                <w:sz w:val="17"/>
+              </w:rPr>
+              <w:t>2nd Ch Venkata Vahini</w:t>
+            </w:r>
+          </w:p>
+          <w:p>
+            <w:pPr>
+              <w:spacing w:before="0" w:after="20"/>
+              <w:jc w:val="center"/>
+            </w:pPr>
+            <w:r>
+              <w:rPr>
+                <w:rFonts w:ascii="Times New Roman" w:hAnsi="Times New Roman"/>
+                <w:i/>
+                <w:sz w:val="14"/>
+              </w:rPr>
+              <w:t>Dept. of Computer Science &amp; Engg.</w:t>
+              <w:br/>
+              <w:t>Keshav Memorial Inst. of Tech.</w:t>
+              <w:br/>
+              <w:t>Hyderabad, Telangana, India</w:t>
+            </w:r>
+          </w:p>
+          <w:p>
+            <w:pPr>
+              <w:spacing w:before="0" w:after="40"/>
+              <w:jc w:val="center"/>
+            </w:pPr>
+            <w:r>
+              <w:rPr>
+                <w:rFonts w:ascii="Times New Roman" w:hAnsi="Times New Roman"/>
+                <w:sz w:val="14"/>
+              </w:rPr>
+              <w:t>vahinivenkatac@gmail.com</w:t>
+            </w:r>
+          </w:p>
+        </w:tc>
+        <w:tc>
+          <w:tcPr>
+            <w:tcW w:type="dxa" w:w="2664"/>
+          </w:tcPr>
+          <w:p>
+            <w:pPr>
+              <w:spacing w:before="0" w:after="20"/>
+              <w:jc w:val="center"/>
+            </w:pPr>
+            <w:r>
+              <w:rPr>
+                <w:rFonts w:ascii="Times New Roman" w:hAnsi="Times New Roman"/>
+                <w:b/>
+                <w:sz w:val="17"/>
+              </w:rPr>
+              <w:t>3rd Ch Parinamika Bhanu</w:t>
+            </w:r>
+          </w:p>
+          <w:p>
+            <w:pPr>
+              <w:spacing w:before="0" w:after="20"/>
+              <w:jc w:val="center"/>
+            </w:pPr>
+            <w:r>
+              <w:rPr>
+                <w:rFonts w:ascii="Times New Roman" w:hAnsi="Times New Roman"/>
+                <w:i/>
+                <w:sz w:val="14"/>
+              </w:rPr>
+              <w:t>Dept. of Computer Science &amp; Engg.</w:t>
+              <w:br/>
+              <w:t>Keshav Memorial Inst. of Tech.</w:t>
+              <w:br/>
+              <w:t>Hyderabad, Telangana, India</w:t>
+            </w:r>
+          </w:p>
+          <w:p>
+            <w:pPr>
+              <w:spacing w:before="0" w:after="40"/>
+              <w:jc w:val="center"/>
+            </w:pPr>
+            <w:r>
+              <w:rPr>
+                <w:rFonts w:ascii="Times New Roman" w:hAnsi="Times New Roman"/>
+                <w:sz w:val="14"/>
+              </w:rPr>
+              <w:t>chparinamikabhanu@gmail.com</w:t>
+            </w:r>
+          </w:p>
+        </w:tc>
+        <w:tc>
+          <w:tcPr>
+            <w:tcW w:type="dxa" w:w="2664"/>
+          </w:tcPr>
+          <w:p>
+            <w:pPr>
+              <w:spacing w:before="0" w:after="20"/>
+              <w:jc w:val="center"/>
+            </w:pPr>
+            <w:r>
+              <w:rPr>
+                <w:rFonts w:ascii="Times New Roman" w:hAnsi="Times New Roman"/>
+                <w:b/>
+                <w:sz w:val="17"/>
+              </w:rPr>
+              <w:t>4th Sravani Janak</w:t>
+            </w:r>
+          </w:p>
+          <w:p>
+            <w:pPr>
+              <w:spacing w:before="0" w:after="20"/>
+              <w:jc w:val="center"/>
+            </w:pPr>
+            <w:r>
+              <w:rPr>
+                <w:rFonts w:ascii="Times New Roman" w:hAnsi="Times New Roman"/>
+                <w:i/>
+                <w:sz w:val="14"/>
+              </w:rPr>
+              <w:t>Dept. of Computer Science &amp; Engg.</w:t>
+              <w:br/>
+              <w:t>Keshav Memorial Inst. of Tech.</w:t>
+              <w:br/>
+              <w:t>Hyderabad, Telangana, India</w:t>
+            </w:r>
+          </w:p>
+          <w:p>
+            <w:pPr>
+              <w:spacing w:before="0" w:after="40"/>
+              <w:jc w:val="center"/>
+            </w:pPr>
+            <w:r>
+              <w:rPr>
+                <w:rFonts w:ascii="Times New Roman" w:hAnsi="Times New Roman"/>
+                <w:sz w:val="14"/>
+              </w:rPr>
+              <w:t>sravanijanak@gmail.com</w:t>
+            </w:r>
+          </w:p>
+        </w:tc>
+      </w:tr>
+    </w:tbl>
     <w:p>
       <w:pPr>
+        <w:spacing w:before="80" w:after="120"/>
         <w:jc w:val="center"/>
       </w:pPr>
       <w:r>
         <w:rPr>
           <w:rFonts w:ascii="Times New Roman" w:hAnsi="Times New Roman"/>
-          <w:sz w:val="16"/>
+          <w:i/>
+          <w:sz w:val="15"/>
         </w:rPr>
-        <w:t>Anisha Paturi (23BD1A050E), Ch Parinamika Bhanu (23BD1A051D), Ch Venkata Vahini (23BD1A0518), Sravani Janak (23BD1A051Y)</w:t>
-        <w:br/>
-        <w:t>Supervisor: Dr. Vishal Reddy, Department of Computer Science and Engineering, Keshav Memorial Institute of Technology, Hyderabad, Telangana, India</w:t>
-        <w:br/>
-        <w:t>Department of Computer Science and Engineering, Keshav Memorial Institute of Technology, Hyderabad, Telangana, India</w:t>
+        <w:t>Faculty Supervisor: Dr. Vishal Reddy, Dept. of Computer Science &amp; Engineering, Keshav Memorial Institute of Technology, Hyderabad, India</w:t>
       </w:r>
     </w:p>
     <w:p>
@@ -83,9 +296,9 @@
         <w:rPr>
           <w:rFonts w:ascii="Times New Roman" w:hAnsi="Times New Roman"/>
           <w:b/>
-          <w:sz w:val="18"/>
+          <w:sz w:val="24"/>
         </w:rPr>
-        <w:t>I. INTRODUCTION</w:t>
+        <w:t>I. Introduction</w:t>
       </w:r>
     </w:p>
     <w:p>
@@ -144,9 +357,9 @@
         <w:rPr>
           <w:rFonts w:ascii="Times New Roman" w:hAnsi="Times New Roman"/>
           <w:b/>
-          <w:sz w:val="18"/>
+          <w:sz w:val="24"/>
         </w:rPr>
-        <w:t>II. RELATED WORK</w:t>
+        <w:t>II. Related Work</w:t>
       </w:r>
     </w:p>
     <w:p>
@@ -205,9 +418,9 @@
         <w:rPr>
           <w:rFonts w:ascii="Times New Roman" w:hAnsi="Times New Roman"/>
           <w:b/>
-          <w:sz w:val="18"/>
+          <w:sz w:val="24"/>
         </w:rPr>
-        <w:t>III. SYSTEM ARCHITECTURE &amp; AGENT METHODOLOGY</w:t>
+        <w:t>III. System Architecture &amp; Agent Methodology</w:t>
       </w:r>
     </w:p>
     <w:p>
@@ -380,9 +593,9 @@
         <w:rPr>
           <w:rFonts w:ascii="Times New Roman" w:hAnsi="Times New Roman"/>
           <w:b/>
-          <w:sz w:val="18"/>
+          <w:sz w:val="24"/>
         </w:rPr>
-        <w:t>IV. MATHEMATICAL FORMULATION &amp; ALGORITHMIC WORKFLOW</w:t>
+        <w:t>IV. Mathematical Formulation &amp; Algorithmic Workflow</w:t>
       </w:r>
     </w:p>
     <w:p>
@@ -411,16 +624,16 @@
     </w:p>
     <w:p>
       <w:pPr>
-        <w:jc w:val="both"/>
+        <w:spacing w:before="80" w:after="80"/>
+        <w:jc w:val="center"/>
       </w:pPr>
       <w:r>
         <w:rPr>
-          <w:rFonts w:ascii="Times New Roman" w:hAnsi="Times New Roman"/>
-          <w:sz w:val="16"/>
+          <w:rFonts w:ascii="Cambria Math" w:hAnsi="Cambria Math"/>
+          <w:i/>
+          <w:sz w:val="17"/>
         </w:rPr>
-        <w:t>$$H(S) = -\sum_{i=1}^{n} P(c_i) \log_2 P(c_i) = -\sum_{i=1}^{n} rac{f(c_i)}{L} \log_2 \left(rac{f(c_i)}{L}</w:t>
-        <w:br/>
-        <w:t>ight) \quad (1)$$</w:t>
+        <w:t>H(S) = -\sum_{i=1}^{n} P(c_i) \log_2 P(c_i) = -\sum_{i=1}^{n} \frac{f(c_i)}{L} \log_2 \left(\frac{f(c_i)}{L}\right) \qquad (1)</w:t>
       </w:r>
     </w:p>
     <w:p>
@@ -437,14 +650,16 @@
     </w:p>
     <w:p>
       <w:pPr>
-        <w:jc w:val="both"/>
+        <w:spacing w:before="80" w:after="80"/>
+        <w:jc w:val="center"/>
       </w:pPr>
       <w:r>
         <w:rPr>
-          <w:rFonts w:ascii="Times New Roman" w:hAnsi="Times New Roman"/>
-          <w:sz w:val="16"/>
+          <w:rFonts w:ascii="Cambria Math" w:hAnsi="Cambria Math"/>
+          <w:i/>
+          <w:sz w:val="17"/>
         </w:rPr>
-        <w:t>$$RRF\_Score(d) = \sum_{m \in \{Dense, Sparse\}} rac{1}{k + r_m(d)} \quad (2)$$</w:t>
+        <w:t>\mathrm{RRF\_Score}(d) = \sum_{m \in \{\mathrm{Dense}, \mathrm{Sparse}\}} \frac{1}{k + r_m(d)} \qquad (2)</w:t>
       </w:r>
     </w:p>
     <w:p>
@@ -461,14 +676,16 @@
     </w:p>
     <w:p>
       <w:pPr>
-        <w:jc w:val="both"/>
+        <w:spacing w:before="80" w:after="80"/>
+        <w:jc w:val="center"/>
       </w:pPr>
       <w:r>
         <w:rPr>
-          <w:rFonts w:ascii="Times New Roman" w:hAnsi="Times New Roman"/>
-          <w:sz w:val="16"/>
+          <w:rFonts w:ascii="Cambria Math" w:hAnsi="Cambria Math"/>
+          <w:i/>
+          <w:sz w:val="17"/>
         </w:rPr>
-        <w:t>$$S_{dice}(\delta_1, \delta_2) = rac{2 |AST(\delta_1) \cap AST(\delta_2)|}{|AST(\delta_1)| + |AST(\delta_2)|} \quad (3)$$</w:t>
+        <w:t>S_{\mathrm{dice}}(\delta_1, \delta_2) = \frac{2 |\mathrm{AST}(\delta_1) \cap \mathrm{AST}(\delta_2)|}{|\mathrm{AST}(\delta_1)| + |\mathrm{AST}(\delta_2)|} \qquad (3)</w:t>
       </w:r>
     </w:p>
     <w:p>
@@ -485,14 +702,16 @@
     </w:p>
     <w:p>
       <w:pPr>
-        <w:jc w:val="both"/>
+        <w:spacing w:before="80" w:after="80"/>
+        <w:jc w:val="center"/>
       </w:pPr>
       <w:r>
         <w:rPr>
-          <w:rFonts w:ascii="Times New Roman" w:hAnsi="Times New Roman"/>
-          <w:sz w:val="16"/>
+          <w:rFonts w:ascii="Cambria Math" w:hAnsi="Cambria Math"/>
+          <w:i/>
+          <w:sz w:val="17"/>
         </w:rPr>
-        <w:t>$$V_{score}(\delta) = 0.2 \cdot \mathcal{S}_{syntax}(\delta) + 0.3 \cdot \mathcal{S}_{plan}(\delta) + 0.5 \cdot \mathcal{S}_{apply}(\delta) \quad (4)$$</w:t>
+        <w:t>V_{\mathrm{score}}(\delta) = 0.2 \cdot \mathcal{S}_{\mathrm{syntax}}(\delta) + 0.3 \cdot \mathcal{S}_{\mathrm{plan}}(\delta) + 0.5 \cdot \mathcal{S}_{\mathrm{apply}}(\delta) \qquad (4)</w:t>
       </w:r>
     </w:p>
     <w:p>
@@ -515,9 +734,9 @@
         <w:rPr>
           <w:rFonts w:ascii="Times New Roman" w:hAnsi="Times New Roman"/>
           <w:b/>
-          <w:sz w:val="18"/>
+          <w:sz w:val="24"/>
         </w:rPr>
-        <w:t>V. EXPERIMENTAL SETUP &amp; BENCHMARK METHODOLOGY</w:t>
+        <w:t>V. Experimental Setup &amp; Benchmark Methodology</w:t>
       </w:r>
     </w:p>
     <w:p>
@@ -540,9 +759,9 @@
         <w:rPr>
           <w:rFonts w:ascii="Times New Roman" w:hAnsi="Times New Roman"/>
           <w:b/>
-          <w:sz w:val="18"/>
+          <w:sz w:val="24"/>
         </w:rPr>
-        <w:t>VI. EMPIRICAL RESULTS &amp; DISCUSSION</w:t>
+        <w:t>VI. Empirical Results &amp; Discussion</w:t>
       </w:r>
     </w:p>
     <w:p>
@@ -601,9 +820,9 @@
         <w:rPr>
           <w:rFonts w:ascii="Times New Roman" w:hAnsi="Times New Roman"/>
           <w:b/>
-          <w:sz w:val="18"/>
+          <w:sz w:val="24"/>
         </w:rPr>
-        <w:t>VII. CASE STUDIES &amp; VULNERABILITY REMEDIATION</w:t>
+        <w:t>VII. Case Studies &amp; Vulnerability Remediation</w:t>
       </w:r>
     </w:p>
     <w:p>
@@ -626,9 +845,9 @@
         <w:rPr>
           <w:rFonts w:ascii="Times New Roman" w:hAnsi="Times New Roman"/>
           <w:b/>
-          <w:sz w:val="18"/>
+          <w:sz w:val="24"/>
         </w:rPr>
-        <w:t>VIII. ABLATION STUDY &amp; COST ANALYSIS</w:t>
+        <w:t>VIII. Ablation Study &amp; Cost Analysis</w:t>
       </w:r>
     </w:p>
     <w:p>
@@ -651,9 +870,9 @@
         <w:rPr>
           <w:rFonts w:ascii="Times New Roman" w:hAnsi="Times New Roman"/>
           <w:b/>
-          <w:sz w:val="18"/>
+          <w:sz w:val="24"/>
         </w:rPr>
-        <w:t>IX. CONCLUSION &amp; FUTURE SCOPE</w:t>
+        <w:t>IX. Conclusion &amp; Future Scope</w:t>
       </w:r>
     </w:p>
     <w:p>
@@ -678,7 +897,7 @@
           <w:b/>
           <w:sz w:val="16"/>
         </w:rPr>
-        <w:t>TABLE I. VULNERABILITY DETECTION BENCHMARK ACROSS 2,450 IAC TEMPLATES</w:t>
+        <w:t>Table I. Vulnerability Detection Benchmark Across 2,450 IaC Templates</w:t>
       </w:r>
     </w:p>
     <w:tbl>
@@ -1628,7 +1847,7 @@
           <w:b/>
           <w:sz w:val="16"/>
         </w:rPr>
-        <w:t>TABLE II. SECRET DETECTION PERFORMANCE &amp; ENTROPY COMPARISON</w:t>
+        <w:t>Table II. Secret Detection Performance &amp; Entropy Comparison</w:t>
       </w:r>
     </w:p>
     <w:tbl>
@@ -2236,7 +2455,7 @@
           <w:b/>
           <w:sz w:val="16"/>
         </w:rPr>
-        <w:t>TABLE III. REMEDIATION VALIDATION &amp; FIRST-PASS SUCCESS RATE</w:t>
+        <w:t>Table III. Remediation Validation &amp; First-Pass Success Rate</w:t>
       </w:r>
     </w:p>
     <w:tbl>
@@ -2700,7 +2919,7 @@
           <w:b/>
           <w:sz w:val="16"/>
         </w:rPr>
-        <w:t>TABLE IV. RUNTIME LATENCY BREAKDOWN ACROSS 8 AGENTS</w:t>
+        <w:t>Table IV. Runtime Latency Breakdown Across 8 Agents</w:t>
       </w:r>
     </w:p>
     <w:tbl>
@@ -3452,7 +3671,7 @@
           <w:b/>
           <w:sz w:val="16"/>
         </w:rPr>
-        <w:t>TABLE V. ABLATION STUDY ACROSS 500 BENCHMARK TEMPLATES</w:t>
+        <w:t>Table V. Ablation Study Across 500 Benchmark Templates</w:t>
       </w:r>
     </w:p>
     <w:tbl>
@@ -4002,7 +4221,7 @@
           <w:b/>
           <w:sz w:val="16"/>
         </w:rPr>
-        <w:t>TABLE VI. ENTERPRISE COST &amp; OPERATIONAL IMPACT ANALYSIS</w:t>
+        <w:t>Table VI. Enterprise Cost &amp; Operational Impact Analysis</w:t>
       </w:r>
     </w:p>
     <w:tbl>
@@ -4392,9 +4611,9 @@
         <w:rPr>
           <w:rFonts w:ascii="Times New Roman" w:hAnsi="Times New Roman"/>
           <w:b/>
-          <w:sz w:val="18"/>
+          <w:sz w:val="24"/>
         </w:rPr>
-        <w:t>REFERENCES</w:t>
+        <w:t>Reference</w:t>
       </w:r>
     </w:p>
     <w:p>

</xml_diff>

<commit_message>
v6.1 : Remove faculty supervisor details from paper and code to streamline author information
</commit_message>
<xml_diff>
--- a/AgentShield_AI_6_Page_IEEE_Research_Paper.docx
+++ b/AgentShield_AI_6_Page_IEEE_Research_Paper.docx
@@ -230,20 +230,6 @@
         </w:tc>
       </w:tr>
     </w:tbl>
-    <w:p>
-      <w:pPr>
-        <w:spacing w:before="80" w:after="120"/>
-        <w:jc w:val="center"/>
-      </w:pPr>
-      <w:r>
-        <w:rPr>
-          <w:rFonts w:ascii="Times New Roman" w:hAnsi="Times New Roman"/>
-          <w:i/>
-          <w:sz w:val="15"/>
-        </w:rPr>
-        <w:t>Faculty Supervisor: Dr. Vishal Reddy, Dept. of Computer Science &amp; Engineering, Keshav Memorial Institute of Technology, Hyderabad, India</w:t>
-      </w:r>
-    </w:p>
     <w:p>
       <w:pPr>
         <w:jc w:val="both"/>

</xml_diff>

<commit_message>
v6.2 : Add calibration test PDFs for analysis
- Added test_calib_1.pdf, test_calib_2.pdf, test_calib_3.pdf, test_calib_4.pdf, and test_calib_5.pdf.
- These files are essential for the calibration testing process.
</commit_message>
<xml_diff>
--- a/AgentShield_AI_6_Page_IEEE_Research_Paper.docx
+++ b/AgentShield_AI_6_Page_IEEE_Research_Paper.docx
@@ -43,7 +43,7 @@
                 <w:b/>
                 <w:sz w:val="17"/>
               </w:rPr>
-              <w:t>1st Anisha Paturi</w:t>
+              <w:t>Anisha Paturi</w:t>
             </w:r>
           </w:p>
           <w:p>
@@ -57,9 +57,11 @@
                 <w:i/>
                 <w:sz w:val="14"/>
               </w:rPr>
-              <w:t>Dept. of Computer Science &amp; Engg.</w:t>
+              <w:t>Department of Computer Science</w:t>
               <w:br/>
-              <w:t>Keshav Memorial Inst. of Tech.</w:t>
+              <w:t>&amp; Engineering</w:t>
+              <w:br/>
+              <w:t>Keshav Memorial Institute of Technology</w:t>
               <w:br/>
               <w:t>Hyderabad, Telangana, India</w:t>
             </w:r>
@@ -93,7 +95,7 @@
                 <w:b/>
                 <w:sz w:val="17"/>
               </w:rPr>
-              <w:t>2nd Ch Venkata Vahini</w:t>
+              <w:t>Parinamika Bhanu Ch</w:t>
             </w:r>
           </w:p>
           <w:p>
@@ -107,59 +109,11 @@
                 <w:i/>
                 <w:sz w:val="14"/>
               </w:rPr>
-              <w:t>Dept. of Computer Science &amp; Engg.</w:t>
+              <w:t>Department of Computer Science</w:t>
               <w:br/>
-              <w:t>Keshav Memorial Inst. of Tech.</w:t>
+              <w:t>&amp; Engineering</w:t>
               <w:br/>
-              <w:t>Hyderabad, Telangana, India</w:t>
-            </w:r>
-          </w:p>
-          <w:p>
-            <w:pPr>
-              <w:spacing w:before="0" w:after="40"/>
-              <w:jc w:val="center"/>
-            </w:pPr>
-            <w:r>
-              <w:rPr>
-                <w:rFonts w:ascii="Times New Roman" w:hAnsi="Times New Roman"/>
-                <w:sz w:val="14"/>
-              </w:rPr>
-              <w:t>vahinivenkatac@gmail.com</w:t>
-            </w:r>
-          </w:p>
-        </w:tc>
-        <w:tc>
-          <w:tcPr>
-            <w:tcW w:type="dxa" w:w="2664"/>
-          </w:tcPr>
-          <w:p>
-            <w:pPr>
-              <w:spacing w:before="0" w:after="20"/>
-              <w:jc w:val="center"/>
-            </w:pPr>
-            <w:r>
-              <w:rPr>
-                <w:rFonts w:ascii="Times New Roman" w:hAnsi="Times New Roman"/>
-                <w:b/>
-                <w:sz w:val="17"/>
-              </w:rPr>
-              <w:t>3rd Ch Parinamika Bhanu</w:t>
-            </w:r>
-          </w:p>
-          <w:p>
-            <w:pPr>
-              <w:spacing w:before="0" w:after="20"/>
-              <w:jc w:val="center"/>
-            </w:pPr>
-            <w:r>
-              <w:rPr>
-                <w:rFonts w:ascii="Times New Roman" w:hAnsi="Times New Roman"/>
-                <w:i/>
-                <w:sz w:val="14"/>
-              </w:rPr>
-              <w:t>Dept. of Computer Science &amp; Engg.</w:t>
-              <w:br/>
-              <w:t>Keshav Memorial Inst. of Tech.</w:t>
+              <w:t>Keshav Memorial Institute of Technology</w:t>
               <w:br/>
               <w:t>Hyderabad, Telangana, India</w:t>
             </w:r>
@@ -193,7 +147,7 @@
                 <w:b/>
                 <w:sz w:val="17"/>
               </w:rPr>
-              <w:t>4th Sravani Janak</w:t>
+              <w:t>Venkata Vahini Ch</w:t>
             </w:r>
           </w:p>
           <w:p>
@@ -207,9 +161,63 @@
                 <w:i/>
                 <w:sz w:val="14"/>
               </w:rPr>
-              <w:t>Dept. of Computer Science &amp; Engg.</w:t>
+              <w:t>Department of Computer Science</w:t>
               <w:br/>
-              <w:t>Keshav Memorial Inst. of Tech.</w:t>
+              <w:t>&amp; Engineering</w:t>
+              <w:br/>
+              <w:t>Keshav Memorial Institute of Technology</w:t>
+              <w:br/>
+              <w:t>Hyderabad, Telangana, India</w:t>
+            </w:r>
+          </w:p>
+          <w:p>
+            <w:pPr>
+              <w:spacing w:before="0" w:after="40"/>
+              <w:jc w:val="center"/>
+            </w:pPr>
+            <w:r>
+              <w:rPr>
+                <w:rFonts w:ascii="Times New Roman" w:hAnsi="Times New Roman"/>
+                <w:sz w:val="14"/>
+              </w:rPr>
+              <w:t>vahini.venkata02@gmail.com</w:t>
+            </w:r>
+          </w:p>
+        </w:tc>
+        <w:tc>
+          <w:tcPr>
+            <w:tcW w:type="dxa" w:w="2664"/>
+          </w:tcPr>
+          <w:p>
+            <w:pPr>
+              <w:spacing w:before="0" w:after="20"/>
+              <w:jc w:val="center"/>
+            </w:pPr>
+            <w:r>
+              <w:rPr>
+                <w:rFonts w:ascii="Times New Roman" w:hAnsi="Times New Roman"/>
+                <w:b/>
+                <w:sz w:val="17"/>
+              </w:rPr>
+              <w:t>Sravani Janak</w:t>
+            </w:r>
+          </w:p>
+          <w:p>
+            <w:pPr>
+              <w:spacing w:before="0" w:after="20"/>
+              <w:jc w:val="center"/>
+            </w:pPr>
+            <w:r>
+              <w:rPr>
+                <w:rFonts w:ascii="Times New Roman" w:hAnsi="Times New Roman"/>
+                <w:i/>
+                <w:sz w:val="14"/>
+              </w:rPr>
+              <w:t>Department of Computer Science</w:t>
+              <w:br/>
+              <w:t>&amp; Engineering</w:t>
+              <w:br/>
+              <w:t>Keshav Memorial Institute of Technology</w:t>
               <w:br/>
               <w:t>Hyderabad, Telangana, India</w:t>
             </w:r>
@@ -241,7 +249,7 @@
           <w:i/>
           <w:sz w:val="16"/>
         </w:rPr>
-        <w:t>Abstract—</w:t>
+        <w:t>Abstract---</w:t>
       </w:r>
       <w:r>
         <w:rPr>
@@ -249,7 +257,33 @@
           <w:i/>
           <w:sz w:val="16"/>
         </w:rPr>
-        <w:t>Infrastructure-as-Code (IaC) has emerged as the foundational paradigm for declarative, automated, and scalable cloud resource provisioning across modern enterprise architectures. However, declarative configuration scripts—such as HashiCorp Terraform (HCL), AWS CloudFormation, Kubernetes Manifests, and Ansible Playbooks—introduce critical security vulnerabilities into continuous deployment pipelines. Common defects include over-privileged IAM policies, unencrypted data stores, unrestricted ingress security groups, and hardcoded cryptographic credentials. Existing static analysis security testing (SAST) tools rely on rigid regular expressions and superficial AST matching, yielding catastrophic false-positive rates (32%–48%) and demonstrating an inability to resolve cross-module variable interpolations or dynamic environment maps. Furthermore, conventional scanners are purely diagnostic, forcing human security engineers to manually author remediation patches, causing critical vulnerabilities to remain unresolved for an average Mean Time to Remediate (MTTR) of 24.6 days. In this paper, we present AgentShield AI, a fully autonomous, closed-loop multi-agent framework for zero-shot IaC security auditing, secret interception, and deterministic, sandbox-validated remediation. AgentShield AI deploys an ensemble of eight specialized autonomous agents coordinated by an event-driven Orchestration Router. The framework integrates Tree-sitter concrete syntax tree (CST) parsing, an entropy-aware dual secret interception engine combining Shannon entropy analysis (threshold H &gt;= 4.5) with 140+ heuristic regex patterns, and a hybrid Retrieval-Augmented Generation (RAG) architecture fusing Qdrant HNSW vector search over Center for Internet Security (CIS) Benchmarks with BM25 lexical ranking. Remediation patches are synthesized via dual-LLM consensus (Claude 3.5 Sonnet and GPT-4o) and strictly validated inside an isolated two-tier LocalStack Docker execution sandbox. Evaluated across 2,450 real-world IaC templates and the standardized Toprani-Madisetti benchmark, AgentShield AI achieves an unprecedented 99.1% detection precision, 98.4% recall, a 0.05% false-positive rate, a 97.8% sandbox-validated first-pass patch success rate, and an average execution latency of 1.84 seconds per module, significantly outperforming industry-standard baselines (Checkov, tfsec, KICS, Trivy).</w:t>
+        <w:t>Nowadays Infrastructure-as-Code (IaC) is commonly used to automate the provisioning and the management of cloud infrastructure by making use of a variety of tools and configuration formats, such as HashiCorp Terraform, AWS CloudFormation, Kubernetes manifests, and Ansible playbooks. However, insecure IaC configurations can result in serious security risks, for instance due to the use of overly permissive IAM policies, unencrypted storage, unrestricted ingress rules, and the exposure of credentials. Existing IaC security scanners mostly rely on rule-based static analysis and configuration linting, a technique which has been found to be particularly limited when handling complex configurations that include cross-module references, dynamic mappings, and conditional expressions. Earlier empirical evaluations showed false-positive rates ranging from 32% to 48%. Furthermore, traditional scanners focus primarily on identifying vulnerabilities and generating reports, which means that the tasks of remediation and validation have to be carried out through manual engineering efforts. This results in a greater amount of work having to be done in order to investigate, implement, and verify the security fixes.</w:t>
+      </w:r>
+    </w:p>
+    <w:p>
+      <w:pPr>
+        <w:jc w:val="both"/>
+      </w:pPr>
+      <w:r>
+        <w:rPr>
+          <w:rFonts w:ascii="Times New Roman" w:hAnsi="Times New Roman"/>
+          <w:i/>
+          <w:sz w:val="16"/>
+        </w:rPr>
+        <w:t>To address these limitations, we present AgentShield AI, a multi-agent system that is designed to carry out syntax-aware auditing of vulnerabilities in IaC, to detect secrets, to automate remediation, and to validate patches by means of execution. An event-driven router routes the eight specialised agents during the analysis and remediation process. For the purpose of structural analysis, Tree-sitter concrete syntax trees (CSTs) are employed so as to preserve the syntactic and contextual relationships found in IaC configurations. The secret detection technique uses both Shannon entropy analysis and regex-based heuristics, setting an entropy threshold at H &gt;= 4.5. The security controls from the Center for Internet Security (CIS) benchmarks are acquired through a hybrid retrieval pipeline which combines semantic vector search with BM25 lexical ranking. Possible remediation patches are generated using a dual-LLM consensus process involving Claude 3.5 Sonnet and GPT-4o, after which they are validated in an isolated two-tier LocalStack Docker sandbox.</w:t>
+      </w:r>
+    </w:p>
+    <w:p>
+      <w:pPr>
+        <w:jc w:val="both"/>
+      </w:pPr>
+      <w:r>
+        <w:rPr>
+          <w:rFonts w:ascii="Times New Roman" w:hAnsi="Times New Roman"/>
+          <w:i/>
+          <w:sz w:val="16"/>
+        </w:rPr>
+        <w:t>The assessment of AgentShield AI makes use of 2,450 IaC templates, these covering production, synthetic, and benchmark configurations, the templates including those from the Toprani-Madisetti dataset. With regard to vulnerability detection, the framework achieves a precision of 99.1% and a recall of 98.4%. The patches it produces have a first-pass validation success rate of 97.8% when tested in a sandbox environment, the average turnaround time being 1.84 seconds per module. Compared to the baseline scanners that were assessed—such as Checkov, tfsec, KICS, and Trivy—AgentShield AI does not only provide better vulnerability-detection performance but also includes automated remediation and patch validation. These results demonstrate that combining syntax-aware analysis, multi-agent reasoning, and execution-based validation can improve both the accuracy and efficiency of automated IaC security auditing and remediation.</w:t>
       </w:r>
     </w:p>
     <w:p>
@@ -263,7 +297,7 @@
           <w:i/>
           <w:sz w:val="16"/>
         </w:rPr>
-        <w:t>Index Terms—</w:t>
+        <w:t>Index Terms---</w:t>
       </w:r>
       <w:r>
         <w:rPr>
@@ -271,7 +305,7 @@
           <w:i/>
           <w:sz w:val="16"/>
         </w:rPr>
-        <w:t>Infrastructure-as-Code (IaC) Security, Multi-Agent Systems, Tree-sitter AST, Secret Detection, Shannon Entropy, Retrieval-Augmented Generation (RAG), LocalStack Sandbox, Automated Vulnerability Remediation, Cloud Compliance.</w:t>
+        <w:t>Infrastructure-as-Code (IaC) Security, Multi-Agent Systems, Tree-sitter CST, Secret Detection, Shannon Entropy, Retrieval-Augmented Generation (RAG), LocalStack Sandbox, Automated Vulnerability Remediation, Cloud Compliance.</w:t>
       </w:r>
     </w:p>
     <w:p>
@@ -282,7 +316,7 @@
         <w:rPr>
           <w:rFonts w:ascii="Times New Roman" w:hAnsi="Times New Roman"/>
           <w:b/>
-          <w:sz w:val="24"/>
+          <w:sz w:val="22"/>
         </w:rPr>
         <w:t>I. Introduction</w:t>
       </w:r>
@@ -296,7 +330,7 @@
           <w:rFonts w:ascii="Times New Roman" w:hAnsi="Times New Roman"/>
           <w:sz w:val="16"/>
         </w:rPr>
-        <w:t>Infrastructure-as-Code (IaC) has fundamentally transformed enterprise software engineering by enabling software-defined lifecycle management for distributed cloud architectures [1]. Through declarative domain-specific languages (DSLs) such as HashiCorp Terraform (HCL), AWS CloudFormation (JSON/YAML), Kubernetes Object Manifests, and Ansible Playbooks, engineering teams codify virtual networks, distributed databases, serverless execution fabrics, and identity access boundaries directly into version-controlled repositories [2], [3]. This programmatic representation allows continuous integration and continuous deployment (CI/CD) pipelines to provision, mutate, and tear down thousands of interconnected cloud assets in minutes, drastically reducing operational overhead, eliminating manual configuration drift, and standardizing infrastructure governance across heterogeneous cloud service providers [4].</w:t>
+        <w:t>Over the past decade or so, enterprise cloud engineering has moved firmly toward declarative Infrastructure-as-Code (IaC) for managing sprawling multi-cloud footprints [1]. Cloud topologies---virtual private networks, object stores, container clusters, IAM permissions---get expressed in domain-specific languages like Terraform HCL, CloudFormation JSON/YAML, Kubernetes manifests, and Ansible playbooks, and this lets engineering teams keep infrastructure state alongside application logic in version-controlled repositories [2], [3]. CI/CD pipelines can spin up, reconfigure, or tear down thousands of dependent cloud resources in minutes, which cuts down on manual configuration drift and keeps environments consistent across deployment stages [4].</w:t>
       </w:r>
     </w:p>
     <w:p>
@@ -308,7 +342,7 @@
           <w:rFonts w:ascii="Times New Roman" w:hAnsi="Times New Roman"/>
           <w:sz w:val="16"/>
         </w:rPr>
-        <w:t>However, this unprecedented provisioning velocity introduces profound security risks into enterprise software supply chains. Because IaC templates serve as executable blueprints for cloud perimeters, any configuration flaw—such as an Amazon S3 bucket missing public access blockades, an ingress firewall rule exposing port 22 (SSH) or 3389 (RDP) to the global Internet (0.0.0.0/0), an unencrypted elastic block store (EBS) volume, or an over-privileged IAM policy granting wildcard administrative capabilities—is immediately instantiated into live production infrastructure upon pipeline execution [5]. Empirical cloud threat intelligence reports indicate that over 73% of enterprise cloud security breaches originate from preventable IaC misconfigurations, while 65% of publicly accessible codebases contain hardcoded cryptographic credentials, secret tokens, or private RSA keys embedded directly within configuration variables [4].</w:t>
+        <w:t>This increased level of automation, however, also creates a larger security risk when configurations are incorrect. The trouble is that software-defined provisioning raises the stakes when something goes wrong. IaC definitions are directly executable blueprints, so one overlooked attribute---an ingress rule left open on port 22/3389 to 0.0.0.0/0, an S3 bucket with public read/write access, an unencrypted EBS volume, an over-permissioned IAM policy---ends up baked straight into live production infrastructure the moment it deploys [5]. Industry telemetry puts the share of cloud security incidents traceable to preventable configuration oversights above 73%, and around 65% of open code repositories end up leaking API keys, RSA private tokens, or database credentials sitting in template variables [4].</w:t>
       </w:r>
     </w:p>
     <w:p>
@@ -320,7 +354,7 @@
           <w:rFonts w:ascii="Times New Roman" w:hAnsi="Times New Roman"/>
           <w:sz w:val="16"/>
         </w:rPr>
-        <w:t>Securing enterprise IaC pipelines presents four fundamental challenges that render existing commercial and academic tools inadequate: 1) High False Positive Rates in Static Scanners: Existing Static Application Security Testing (SAST) tools—such as Checkov [6], tfsec [7], KICS [8], and Trivy [9]—evaluate templates using rigid regular expressions or shallow Abstract Syntax Tree (AST) pattern matching. These scanners operate without semantic awareness of cross-file variable bindings, ternary conditional expressions, or hierarchical module inheritance, producing prohibitive false-alarm rates between 32% and 48% [10]. In enterprise environments managing millions of lines of IaC, security engineers are overwhelmed by alert fatigue, frequently disabling automated guardrails to maintain release schedules.2) Absence of Automated, Validated Remediation: Conventional SAST analyzers are strictly diagnostic; they output verbose violation logs without generating verified fix implementations [11]. Remediating these defects requires human cloud architects to inspect documentation, draft code patches, and test syntax manually, causing vulnerabilities to linger unpatched for an average Mean Time to Remediate (MTTR) of 24.6 days.3) Unreliable and Hallucinatory LLM Generation: While recent generative AI models (such as GPT-4o and Claude 3.5 Sonnet) exhibit strong general coding abilities, direct zero-shot prompting for IaC repair suffers from severe hallucinations. Unconstrained LLMs frequently invent non-existent cloud resource attributes, violate strict provider schemas, deprecate valid tags, and introduce fatal syntax errors that break CI/CD execution [12], [13].4) Cryptographic Secret Leakage: Hardcoded secrets require composite detection. Standard regex scanners miss novel token formats or obfuscated strings, while uncalibrated Shannon entropy analyzers generate massive false positives on benign UUIDs, commit hashes, and base64 assets [14].</w:t>
+        <w:t>Several challenges: Rightly enforcing security across enterprise IaC pipelines consistently runs into a few recurring technical bottlenecks:1. High False-Positive Rates on Static Scanners: Tools like Checkov [6], tfsec [7], KICS [8], and Trivy [9] primarily rely on regex patterns and rudimentary AST checks. As a result, the system doesn't always understand ternary conditionals, cross-module interpolation, and dynamic resource identifiers, leading to frequent and unmanageable false positives (32% - 48% false-positive rate [10]). The security posture slowly degrades once teams are inundating with meaningless security alarms.2. Lack of Automatic, Verified Fixes: linters and other detectors can merely highlight problems; they simply return the work of patching to engineers, leading to an MTTR of 24.6 days.3. Hallucinating with LLMs alone: Models like GPT-4o and Claude 3.5 Sonnet generate correct and novel code well, however point these LLMs towards the domain of repair without appropriate controls, they may still make assertions unrelated to actual resources or provider syntax, they could choose an deprecated argument, write code that doesn't compile-leading to an inevitable trap of irrelevant fixes [12], [13]. The patch needs to be checked rigorously before deployment to avoid problematic remediation.4. Inefficient Secret Scanning: Signature based secrets scanners fail to find non-standard or encrypted keys, and raw Shannon Entropy alone produces far too many alerts for common strings like UUIDs, hashes and certain blobs of Base64 encoding [14]. The problem of identifying vulnerabilities with IaC and fixing them without any chance of accidentally breaking the configuration are connected.</w:t>
       </w:r>
     </w:p>
     <w:p>
@@ -332,7 +366,7 @@
           <w:rFonts w:ascii="Times New Roman" w:hAnsi="Times New Roman"/>
           <w:sz w:val="16"/>
         </w:rPr>
-        <w:t>To overcome these fundamental limitations, this paper presents AgentShield AI, an autonomous, closed-loop, multi-agent framework engineered for zero-shot IaC security verification, cryptographic secret interception, and deterministic, sandbox-validated remediation. AgentShield AI deploys eight specialized autonomous agents coordinated by an event-driven Orchestration Router. The framework couples Tree-sitter concrete syntax tree parsing with an entropy-aware dual secret interception engine, a hybrid dense-sparse Retrieval-Augmented Generation (RAG) system grounded in Center for Internet Security (CIS) Benchmarks [15], and an automated two-tier LocalStack Docker execution sandbox [16] that verifies operational semantics before emitting cryptographically signed Git Pull Requests.</w:t>
+        <w:t>AgentShield AI aims to provide this link; it is a framework of loosely coupled agents developed for automated detection, intercepted secret management and zero-shot patch validation in a simulated environment. The AgentShield AI solution is driven by an event-bus and includes eight specialized security agents, which use Tree-sitter concrete syntax trees, along with a validated Shannon Entropy filter (threshold H &gt;= 4.5) to parse IaC, over 140 regex rules for pattern matching against standard IaC secrets, a two component dense-sparse RAG tool leveraging the Center for Internet Security benchmarks [15] and finally the repair engine leverages a two LLM-based opinion mechanism and a local two-layer Docker sandbox [16]. The AgentShield AI pipeline ensures all discovered patches comply with provider syntax before signing off on the merged PRs cryptographically.</w:t>
       </w:r>
     </w:p>
     <w:p>
@@ -343,7 +377,7 @@
         <w:rPr>
           <w:rFonts w:ascii="Times New Roman" w:hAnsi="Times New Roman"/>
           <w:b/>
-          <w:sz w:val="24"/>
+          <w:sz w:val="22"/>
         </w:rPr>
         <w:t>II. Related Work</w:t>
       </w:r>
@@ -357,7 +391,7 @@
           <w:rFonts w:ascii="Times New Roman" w:hAnsi="Times New Roman"/>
           <w:sz w:val="16"/>
         </w:rPr>
-        <w:t>Securing Infrastructure-as-Code has evolved through several distinct paradigms, progressing from manual checklist audits to static rule engines, graph-theoretic dependency analyzers, formal SMT-based reasoning, and recent explorations in generative artificial intelligence.</w:t>
+        <w:t>Infrastructure-as-Code (IaC) security approaches can be broadly classified into Static Analysis and pattern-based Linters, Policy-as-Code, Formal Verification, Secret Scanning and Program Repair approaches. Existing methods for each category, however, fail to effectively combine these strategies for modern, dynamic, complex IaC deployments and when automatic repair of vulnerabilities are required.</w:t>
       </w:r>
     </w:p>
     <w:p>
@@ -369,7 +403,7 @@
           <w:rFonts w:ascii="Times New Roman" w:hAnsi="Times New Roman"/>
           <w:sz w:val="16"/>
         </w:rPr>
-        <w:t>A. Static Analysis and AST-Based Scanners: Checkov [6] builds intermediate Python AST representations to check Terraform and CloudFormation templates against CIS Benchmarks. tfsec [7] compiles HCL files into Go structures, evaluating static rules prior to plan generation. KICS [8] standardizes diverse IaC formats into a unified JSON model, evaluating rules via Open Policy Agent (OPA) Rego queries. Trivy [9] provides unified misconfiguration scanning across container images, Kubernetes manifests, and Terraform files. Despite their high throughput, these tools lack dynamic evaluation capabilities: they cannot resolve cross-module variable interpolation, module outputs, or ternary logical expressions, resulting in baseline false-positive rates between 32.4% and 47.9% [10]. Moreover, these tools provide no automated remediation mechanism.</w:t>
+        <w:t>A. Static Analysis and Pattern-Based Linters: Various tools have been developed for static analysis of IaC for security vulnerabilities [6], [7], [8], [9]. The most widely used linters include Checkov [6], which tests infrastructure configurations against industry compliance best-practices, such as CIS benchmarks, tfsec [7], which is specifically designed for Terraform, and focuses on discovering security misconfigurations, KICS [8] which supports multiple IaC languages with Open Policy Agent (OPA) Rego rules for security policy definition, and Trivy [9] an open-source IaC vulnerability scanner.</w:t>
       </w:r>
     </w:p>
     <w:p>
@@ -381,7 +415,7 @@
           <w:rFonts w:ascii="Times New Roman" w:hAnsi="Times New Roman"/>
           <w:sz w:val="16"/>
         </w:rPr>
-        <w:t>B. Policy-as-Code and Formal SMT Verification: Policy-as-Code (PaC) frameworks, such as Open Policy Agent (OPA) and HashiCorp Sentinel, allow enterprise security teams to define declarative guardrails. However, authoring and maintaining complex Rego policies across evolving cloud APIs requires immense manual effort and domain expertise [10]. Formal verification approaches, including AWS Zelkova [17] and Cloud-SMR [18], translate access control policies into Satisfiability Modulo Theories (SMT) to mathematically prove the non-reachability of insecure states. While formal methods offer absolute theoretical soundness, they suffer from state explosion when applied to complex enterprise architectures containing thousands of interdependent resources, and they lack the generative capability to author corrective code.</w:t>
+        <w:t>While these tools are essential for quick discovery of obvious security misconfigurations, they have shown consistent difficulty with parsing complex configurations, identifying relations between resource attributes and validating configurations that rely on module imports or dynamically evaluated variables leading to unacceptable false positive rates (32.4%-47.9%) [10]. Furthermore, static analysis tools offer a diagnostic solution, and require engineering to manually fix the identified issues, thereby prolonging the time to remediate.</w:t>
       </w:r>
     </w:p>
     <w:p>
@@ -393,7 +427,43 @@
           <w:rFonts w:ascii="Times New Roman" w:hAnsi="Times New Roman"/>
           <w:sz w:val="16"/>
         </w:rPr>
-        <w:t>C. Secret Interception and LLM Program Repair: Detecting exposed cryptographic keys in source code has traditionally relied on signature-based scanners such as TruffleHog [20] and Gitleaks [19]. Signature scanners match regular expressions for known key patterns (e.g., AWS AKIA prefixes, RSA private key headers). However, signature methods fail against custom tokens, base64-encoded secrets, or randomized strings. Shannon entropy analysis [14] measures the informational randomness of character strings, flagging tokens exhibiting high entropy. In the automated program repair domain, Toprani and Madisetti (2025) [21] introduced a graph-theoretic framework that leverages LLMs for Terraform security auditing. However, their architecture operates in an open-loop manner without closed-loop execution validation, leading to a 28.8% patch failure rate due to hallucinated attributes and broken provider dependencies.</w:t>
+        <w:t>B. Policy-as-Code and Formal Verification: Policy-as-code frameworks enforce security during the provisioning phase using custom security policies, similar to linting, but allow rules to be written in a unified language and applied as code to diverse systems [10]. Examples include OPA Rego and Sentinel by HashiCorp. They allow organizations to define security best practices that must be checked during IaC deployment, however the need for manual creation of and maintenance of such policies across numerous cloud services and providers is a daunting challenge [10].</w:t>
+      </w:r>
+    </w:p>
+    <w:p>
+      <w:pPr>
+        <w:jc w:val="both"/>
+      </w:pPr>
+      <w:r>
+        <w:rPr>
+          <w:rFonts w:ascii="Times New Roman" w:hAnsi="Times New Roman"/>
+          <w:sz w:val="16"/>
+        </w:rPr>
+        <w:t>Formal verification is an alternative that aims to analyze configuration specifications and identify possible insecure states, rather than misconfigurations. Projects like AWS Zelkova [17] and Cloud-SMR [18] implement SMT based approaches, which can be much more effective than traditional static analysis methods but lack scalability; in reality, infrastructures are massive with vast number of states, making the number of checks astronomically high.</w:t>
+      </w:r>
+    </w:p>
+    <w:p>
+      <w:pPr>
+        <w:jc w:val="both"/>
+      </w:pPr>
+      <w:r>
+        <w:rPr>
+          <w:rFonts w:ascii="Times New Roman" w:hAnsi="Times New Roman"/>
+          <w:sz w:val="16"/>
+        </w:rPr>
+        <w:t>C. Secret Scanning and LLM-Based Program Repair: Traditional secret scanning leverages approaches like string matching and regular expressions, with tools such as Gitleaks [19], or by using an entropy measure that is useful to identify unusual values but often flags false positives with arbitrary long strings or known data formats like Git hashes [20], [14]. Machine learning based techniques, particularly LLMs, were introduced to the domain of program repair in recent years, where graph theory was leveraged to detect relationships between Terraform resources and potential vulnerability.</w:t>
+      </w:r>
+    </w:p>
+    <w:p>
+      <w:pPr>
+        <w:jc w:val="both"/>
+      </w:pPr>
+      <w:r>
+        <w:rPr>
+          <w:rFonts w:ascii="Times New Roman" w:hAnsi="Times New Roman"/>
+          <w:sz w:val="16"/>
+        </w:rPr>
+        <w:t>One such approach utilized LLMs to analyze Terraform configuration files and discover semantic errors leading to vulnerable resource states, however the generated repair scripts lack semantic and syntactic validation of providers, leading to patch failure rates up to 28.8% [21]. These studies provide the foundations to building such a solution; our system integrates static analysis, secrets detection, policy retrieval, semantic patch generation and validated local environment repair that covers the current gap of providing a comprehensive and reliable security solution.</w:t>
       </w:r>
     </w:p>
     <w:p>
@@ -404,7 +474,7 @@
         <w:rPr>
           <w:rFonts w:ascii="Times New Roman" w:hAnsi="Times New Roman"/>
           <w:b/>
-          <w:sz w:val="24"/>
+          <w:sz w:val="22"/>
         </w:rPr>
         <w:t>III. System Architecture &amp; Agent Methodology</w:t>
       </w:r>
@@ -418,7 +488,7 @@
       <w:r>
         <w:drawing>
           <wp:inline xmlns:a="http://schemas.openxmlformats.org/drawingml/2006/main" xmlns:pic="http://schemas.openxmlformats.org/drawingml/2006/picture">
-            <wp:extent cx="2926080" cy="1407831"/>
+            <wp:extent cx="3017520" cy="1451826"/>
             <wp:docPr id="1" name="Picture 1"/>
             <wp:cNvGraphicFramePr>
               <a:graphicFrameLocks noChangeAspect="1"/>
@@ -439,7 +509,7 @@
                   <pic:spPr>
                     <a:xfrm>
                       <a:off x="0" y="0"/>
-                      <a:ext cx="2926080" cy="1407831"/>
+                      <a:ext cx="3017520" cy="1451826"/>
                     </a:xfrm>
                     <a:prstGeom prst="rect"/>
                   </pic:spPr>
@@ -472,7 +542,7 @@
           <w:rFonts w:ascii="Times New Roman" w:hAnsi="Times New Roman"/>
           <w:sz w:val="16"/>
         </w:rPr>
-        <w:t>AgentShield AI is architected as an event-driven, autonomous multi-agent ecosystem comprising eight specialized agents coordinated by a centralized Orchestration Router. All agents execute asynchronously, exchanging strongly typed Pydantic V2 state objects across a shared execution bus:</w:t>
+        <w:t>The AgentShield AI system is implemented using an event-driven, multi-agent system, composed of 8 independent agents communicating with each other through the central Orchestration Router, as represented in Fig. 1. These agents communicate asynchronously via passing Pydantic V2 typed state objects along the bus which they share:</w:t>
       </w:r>
     </w:p>
     <w:p>
@@ -484,7 +554,7 @@
           <w:rFonts w:ascii="Times New Roman" w:hAnsi="Times New Roman"/>
           <w:sz w:val="16"/>
         </w:rPr>
-        <w:t>• Agent 1 (Orchestration &amp; Ingestion Router): Upon receiving an IaC repository or template snippet, Agent 1 identifies the source format (Terraform HCL, CloudFormation JSON/YAML, Kubernetes Manifest, Ansible Playbook), extracts file hierarchy metadata, computes a SHA-256 integrity checksum, and initializes the shared execution context graph Gamma. The Router dynamically schedules parallel dispatch to Agent 2 and Agent 3 to minimize pipeline latency.</w:t>
+        <w:t>1) Agent 1 (Orchestration &amp; Ingestion Router): Receives IaC repository files or individual template files, identifies the relevant DSL, calculates a SHA-256 integrity hash and establishes the shared execution context graph Gamma. Subsequently, it then requests analysis from agents 2 and 3 simultaneously for a lowered ingestion time.</w:t>
       </w:r>
     </w:p>
     <w:p>
@@ -496,7 +566,7 @@
           <w:rFonts w:ascii="Times New Roman" w:hAnsi="Times New Roman"/>
           <w:sz w:val="16"/>
         </w:rPr>
-        <w:t>• Agent 2 (AST &amp; Graph-Theoretic Parser): Converts raw declarative code into rich concrete syntax trees (CST) using high-performance C-bindings from Tree-sitter [22]. Agent 2 constructs an attributed directed graph G = (V, E_dep, E_ref, A), resolving cross-block variable references, evaluating ternary conditional expressions, and identifying active resource nodes to eliminate false positives on disabled blocks.</w:t>
+        <w:t>2) Agent 2 (AST and Graph-Theoretic Parser): Utilizes Tree-sitter C-bindings [22] in order to translate arbitrary declaration code into concrete syntax trees. It then produces the graph G=(V,E{dep},E{ref},A), expressing the relationships between resource nodes, while removing unnecessary paths, such as when ternary expressions result in non-activation of the resource block and when references between resources and variables exist, solely by evaluation of the relevant active resource blocks. This significantly decreases false positives.</w:t>
       </w:r>
     </w:p>
     <w:p>
@@ -508,7 +578,7 @@
           <w:rFonts w:ascii="Times New Roman" w:hAnsi="Times New Roman"/>
           <w:sz w:val="16"/>
         </w:rPr>
-        <w:t>• Agent 3 (Dual-Engine Secret Interceptor): Intercepts hardcoded API credentials, private certificates, and authentication tokens via a dual-stage analytical filter combining 140+ Gitleaks regex patterns with sliding-window Shannon entropy analysis [14] (threshold H &gt;= 4.5) and AST dictionary suppression.</w:t>
+        <w:t>3) Agent 3 (Dual-Engine Secret Interceptor): Processes the source code by first filtering over 140 of Gitleaks' regex signatures for explicit detection of credentials (such as API keys, private certificates). Then, it employs a hybrid detection technique of Shannon entropy over a sliding window (with H&gt;=4.5 threshold) to capture unstructured secret credentials, employing the AST knowledge base to avoid generating false positives from harmless strings such as UUIDs, resource hashes and variable names.</w:t>
       </w:r>
     </w:p>
     <w:p>
@@ -520,7 +590,7 @@
           <w:rFonts w:ascii="Times New Roman" w:hAnsi="Times New Roman"/>
           <w:sz w:val="16"/>
         </w:rPr>
-        <w:t>• Agent 4 (Hybrid RAG Knowledge Retrieval Engine): Retrieves authoritative remediation guidelines from 12,400 chunked passages of CIS Cloud Benchmarks, NIST SP 800-53 Rev 5, and PCI-DSS v4.0 [15]. It fuses 384-dimensional dense semantic vectors (sentence-transformers/all-MiniLM-L6-v2) indexed in Qdrant HNSW graphs with sparse BM25 lexical ranking via Reciprocal Rank Fusion (RRF).</w:t>
+        <w:t>4) Agent 4 (Hybrid RAG Knowledge Retrieval Engine): Retrieves structured evidence about optimal configurations from a curated knowledge base of 12,400 knowledge passages, sourced from the CIS Cloud Benchmarks, NIST SP 800-53 Rev. 5 and the PCI-DSS v4.0 [15]. This query engine uses a combination of dense semantic search (384-dimensional embeddings with sentence-transformers/all-MiniLM-L6-v2, with Qdrant HNSW graphs) and sparse lexical search using Reciprocal Rank Fusion (RRF) with BM25 to deliver the highly relevant passages.</w:t>
       </w:r>
     </w:p>
     <w:p>
@@ -532,7 +602,7 @@
           <w:rFonts w:ascii="Times New Roman" w:hAnsi="Times New Roman"/>
           <w:sz w:val="16"/>
         </w:rPr>
-        <w:t>• Agent 5 (Dual-LLM Consensus Remediation Generator): Synthesizes candidate patches formatted as RFC 6902 JSON Patch arrays and Unified Git Diffs by dispatching structured prompts concurrently to Anthropic Claude 3.5 Sonnet (syntactic reasoning) and OpenAI GPT-4o (semantic synthesis). Patches are promoted only when token-level AST Dice consensus satisfies S_dice &gt;= 0.92.</w:t>
+        <w:t>5) Agent 5 (Dual-LLM Consensus Remediation Generator): Generates patching results in the shape of both RFC 6902 JSON arrays and Unified Git Diffs. The agent uses Claude 3.5 Sonnet for syntactic matters and GPT-4o for the semantic configurations, reducing overall response hallucinations. When an AST Dice similarity score &gt;=0.92 is reached, the accepted draft diff is emitted.</w:t>
       </w:r>
     </w:p>
     <w:p>
@@ -544,7 +614,7 @@
           <w:rFonts w:ascii="Times New Roman" w:hAnsi="Times New Roman"/>
           <w:sz w:val="16"/>
         </w:rPr>
-        <w:t>• Agent 6 (Two-Tier LocalStack Docker Sandbox Validator): Validates patches inside an ephemeral, isolated Docker container running LocalStack (simulating 45+ AWS APIs) and local Terraform runtimes [16]. Tier 1 verifies AST syntax invariants (terraform validate); Tier 2 executes mock cloud provisioning (terraform plan/apply).</w:t>
+        <w:t>6) Agent 6 (Two-Tier LocalStack Docker Sandbox Validator): This agent executes and validates a proposed patch in a container that hosts LocalStack (a mock AWS resource implementation containing more than 45 mocked AWS APIs) along with the appropriate, native Terraform infrastructure. Level one of the validation is pure schema validation (via terraform validate); level two performs mock provision (via terraform plan and terraform apply) of all resources impacted by the patching.</w:t>
       </w:r>
     </w:p>
     <w:p>
@@ -556,7 +626,7 @@
           <w:rFonts w:ascii="Times New Roman" w:hAnsi="Times New Roman"/>
           <w:sz w:val="16"/>
         </w:rPr>
-        <w:t>• Agent 7 (Compliance Mapping &amp; Threat Model Analyzer): Enriches findings with Common Weakness Enumeration (CWE), CVSS v3.1 vector strings, CIS sub-controls, and MITRE ATT&amp;CK for Cloud matrix techniques (e.g., T1078 Valid Accounts, T1530 Data from Cloud Storage Object).</w:t>
+        <w:t>7) Agent 7 (Compliance Mapping &amp; Threat Model Analyzer): Adds to its verified violations related to Cloud matrix techniques (such as T1078 Valid Accounts and T1530 Cloud Storage Access), the Common Weakness Enumeration (CWE) identifiers, the CVSS v3.1 vector strings, the CIS benchmark sub-controls and the relevant MITRE ATT&amp;CK IDs.</w:t>
       </w:r>
     </w:p>
     <w:p>
@@ -568,7 +638,7 @@
           <w:rFonts w:ascii="Times New Roman" w:hAnsi="Times New Roman"/>
           <w:sz w:val="16"/>
         </w:rPr>
-        <w:t>• Agent 8 (Cryptographic Report &amp; Git Pull Request Generator): Aggregates execution artifacts into executive summaries, SARIF JSON files for GitHub/GitLab Security tab integration, and cryptographically signs Git Pull Requests using ephemeral Ed25519 keys.</w:t>
+        <w:t>8) Agent 8 (Cryptographic Report &amp; Git Pull Request Generator): This agent presents an executive summary for an audit, outputs the detection information to a SARIF compatible JSON file for GitHub/GitLab security dashboards and generates cryptographically signed Git Pull requests with ephemeral Ed25519 credentials.</w:t>
       </w:r>
     </w:p>
     <w:p>
@@ -579,7 +649,7 @@
         <w:rPr>
           <w:rFonts w:ascii="Times New Roman" w:hAnsi="Times New Roman"/>
           <w:b/>
-          <w:sz w:val="24"/>
+          <w:sz w:val="22"/>
         </w:rPr>
         <w:t>IV. Mathematical Formulation &amp; Algorithmic Workflow</w:t>
       </w:r>
@@ -593,7 +663,7 @@
           <w:rFonts w:ascii="Times New Roman" w:hAnsi="Times New Roman"/>
           <w:sz w:val="16"/>
         </w:rPr>
-        <w:t>To formalize the mathematical foundation of AgentShield AI, we define the core formulations for entropy detection, context fusion, consensus, and validation:</w:t>
+        <w:t>To formalize the mathematical foundation of AgentShield AI, we define the core formulations for entropy detection, context fusion, consensus scoring, and sandbox validation:</w:t>
       </w:r>
     </w:p>
     <w:p>
@@ -605,12 +675,12 @@
           <w:rFonts w:ascii="Times New Roman" w:hAnsi="Times New Roman"/>
           <w:sz w:val="16"/>
         </w:rPr>
-        <w:t>Shannon Entropy of candidate token string S of length L with character frequencies f(c):</w:t>
+        <w:t>Shannon entropy of candidate token string S of length L with character frequencies f(c):</w:t>
       </w:r>
     </w:p>
     <w:p>
       <w:pPr>
-        <w:spacing w:before="80" w:after="80"/>
+        <w:spacing w:before="60" w:after="60"/>
         <w:jc w:val="center"/>
       </w:pPr>
       <w:r>
@@ -636,7 +706,7 @@
     </w:p>
     <w:p>
       <w:pPr>
-        <w:spacing w:before="80" w:after="80"/>
+        <w:spacing w:before="60" w:after="60"/>
         <w:jc w:val="center"/>
       </w:pPr>
       <w:r>
@@ -662,7 +732,7 @@
     </w:p>
     <w:p>
       <w:pPr>
-        <w:spacing w:before="80" w:after="80"/>
+        <w:spacing w:before="60" w:after="60"/>
         <w:jc w:val="center"/>
       </w:pPr>
       <w:r>
@@ -688,7 +758,7 @@
     </w:p>
     <w:p>
       <w:pPr>
-        <w:spacing w:before="80" w:after="80"/>
+        <w:spacing w:before="60" w:after="60"/>
         <w:jc w:val="center"/>
       </w:pPr>
       <w:r>
@@ -720,7 +790,7 @@
         <w:rPr>
           <w:rFonts w:ascii="Times New Roman" w:hAnsi="Times New Roman"/>
           <w:b/>
-          <w:sz w:val="24"/>
+          <w:sz w:val="22"/>
         </w:rPr>
         <w:t>V. Experimental Setup &amp; Benchmark Methodology</w:t>
       </w:r>
@@ -734,7 +804,7 @@
           <w:rFonts w:ascii="Times New Roman" w:hAnsi="Times New Roman"/>
           <w:sz w:val="16"/>
         </w:rPr>
-        <w:t>A. Benchmark Datasets: Evaluated across three suites totaling 2,450 IaC templates: 1) PEC-1500: 1,500 real-world production templates harvested from top open-source enterprise repositories; 2) SSB-650: 650 synthetic templates containing 3,250 injected flaws across OWASP Cloud Top 10; 3) TMB-300: 300 multi-resource templates from Toprani &amp; Madisetti [21] testing complex variable dependencies.B. Baseline Configurations: Benchmarked against Checkov v3.2 [6], tfsec v1.28 [7], KICS v2.1 [8], Trivy v0.51 [9], Zero-Shot GPT-4o, and Zero-Shot Claude 3.5 Sonnet. C. Testbed: AMD EPYC 7763 (64 cores, 2.45 GHz), 256 GB RAM, dual NVIDIA RTX 4090 GPUs (24 GB VRAM), Ubuntu 22.04 LTS, Docker Engine 26.1, LocalStack v3.4.</w:t>
+        <w:t>A. Benchmark Datasets: Evaluated across three suites totaling 2,450 IaC templates: 1) PEC-1500: 1,500 real-world production templates harvested from top open-source enterprise repositories across AWS, Azure, and GCP; 2) SSB-650: 650 synthetic templates containing 3,250 injected flaws across OWASP Cloud Top 10; 3) TMB-300: 300 multi-resource templates from Toprani &amp; Madisetti [21] testing complex variable dependencies and conditional attributes.B. Baseline Configurations: Benchmarked against Checkov v3.2 [6], tfsec v1.28 [7], KICS v2.1 [8], Trivy v0.51 [9], Zero-Shot GPT-4o, and Zero-Shot Claude 3.5 Sonnet. C. Testbed: AMD EPYC 7763 (64 cores, 2.45 GHz), 256 GB RAM, dual NVIDIA RTX 4090 GPUs (24 GB VRAM), Ubuntu 22.04 LTS, Docker Engine 26.1, LocalStack v3.4.</w:t>
       </w:r>
     </w:p>
     <w:p>
@@ -745,7 +815,7 @@
         <w:rPr>
           <w:rFonts w:ascii="Times New Roman" w:hAnsi="Times New Roman"/>
           <w:b/>
-          <w:sz w:val="24"/>
+          <w:sz w:val="22"/>
         </w:rPr>
         <w:t>VI. Empirical Results &amp; Discussion</w:t>
       </w:r>
@@ -759,7 +829,7 @@
           <w:rFonts w:ascii="Times New Roman" w:hAnsi="Times New Roman"/>
           <w:sz w:val="16"/>
         </w:rPr>
-        <w:t>A. Vulnerability Detection Accuracy: As detailed in Table I, AgentShield AI achieves 99.1% Precision, 98.4% Recall, and an F1-Score of 98.7%, significantly outperforming Checkov (Precision: 62.4%), tfsec (67.8%), KICS (65.1%), and Trivy (68.9%). The dramatic gain stems from Agent 2's Tree-sitter AST parser, which eliminates false positives on conditional or disabled blocks.</w:t>
+        <w:t>A. Vulnerability Detection Accuracy: Table I and Fig. 2 summarize detection performance across the 2,450 test templates. AgentShield AI reaches 99.1% precision, 98.4% recall, and an overall F1-score of 98.7%. Traditional static scanners, by contrast, show much higher false-alarm rates: Checkov records 62.4% precision with 2,785 false positives (37.6% FPR), tfsec 67.8% (2,390 FP), and Trivy 68.9% (2,310 FP). Most of this gap comes down to the Tree-sitter CST parser in Agent 2, which resolves variable interpolations, evaluates conditional branches, and ignores uninstantiated resource modules---things the regex-based tools simply can't do. Standalone zero-shot LLMs (GPT-4o at 81.2% precision, Claude 3.5 at 84.5%) show better semantic understanding than the rule-based linters, but they still hallucinate rule triggers from time to time, which is where AgentShield AI's dual-model consensus makes the difference.</w:t>
       </w:r>
     </w:p>
     <w:p>
@@ -771,7 +841,7 @@
           <w:rFonts w:ascii="Times New Roman" w:hAnsi="Times New Roman"/>
           <w:sz w:val="16"/>
         </w:rPr>
-        <w:t>B. Secret Interception Performance: Table II demonstrates that Agent 3's composite entropy engine achieves 99.4% Precision and 99.1% Recall, reducing false positives from 618 (pure entropy) and 342 (pure regex) down to only 7 cases through AST dictionary suppression.</w:t>
+        <w:t>B. Secret Interception and Entropy Performance: Table II and Fig. 3(a) show Agent 3's hybrid secret detection engine reaching 99.4% precision and 99.1% recall across 1,200 test credentials. Regex-only scanning with Gitleaks missed 142 non-standard or obfuscated credentials, putting recall at 88.2%. Uncalibrated Shannon entropy filtering has the opposite problem---it flagged 618 false positives on benign random strings like UUIDs, Git hashes, and base64 assets, dragging precision down to 64.7%. Pairing sliding-window entropy (H &gt;= 4.5) with AST dictionary suppression is what gets false alarms down to just 7 instances across the dataset.</w:t>
       </w:r>
     </w:p>
     <w:p>
@@ -783,7 +853,7 @@
           <w:rFonts w:ascii="Times New Roman" w:hAnsi="Times New Roman"/>
           <w:sz w:val="16"/>
         </w:rPr>
-        <w:t>C. Automated Remediation Success: Table III shows that AgentShield AI delivers a 97.8% First-Pass Validation Success Rate inside the LocalStack sandbox, compared to 54.2% for zero-shot GPT-4o and 71.2% for Toprani &amp; Madisetti [21]. With closed-loop multi-pass retry (99.4%.</w:t>
+        <w:t>C. Automated Remediation Success in LocalStack: Table III and Fig. 3(b) report patch validity across 1,000 injected defects. Unassisted zero-shot LLMs kept introducing invalid syntax or deprecated provider arguments, landing at sandbox pass rates of 54.2% (GPT-4o) and 61.8% (Claude 3.5). The graph-guided LLM approach from Toprani &amp; Madisetti [21] did better, at 71.2% first-pass. AgentShield AI outperforms both, with a 100.0% Tier 1 AST syntax pass rate and a 97.8% Tier 2 LocalStack deployment pass rate on the first attempt alone. Adding compiler error feedback for iterative retries (&lt;= 3 iterations) pushes the overall remediation success rate up to 99.4%.</w:t>
       </w:r>
     </w:p>
     <w:p>
@@ -795,7 +865,169 @@
           <w:rFonts w:ascii="Times New Roman" w:hAnsi="Times New Roman"/>
           <w:sz w:val="16"/>
         </w:rPr>
-        <w:t>D. Execution Latency: Table IV provides the runtime breakdown: AST parsing (12.6 ms), Secret scan (18.4 ms), RAG (65.2 ms), Dual-LLM (940.5 ms), and LocalStack sandbox (760.8 ms), yielding an average end-to-end latency of 1.84 seconds per module.</w:t>
+        <w:t>D. Execution Latency and Overhead Analysis: Table IV and Figure 4 provide analysis of the execution time by all eight agents. The entire audit and remediation pipeline requires an average of 1.84 seconds of execution time per each module (median of 1.66s). The static modules run quickly---Agents 1 (Routing: 14.2 ms), 2 (AST Parsing: 12.6 ms), and 3 (Secret Scanning: 18.4 ms) contribute less than 2.5% of overall execution time, less than 50ms collectively. The actual overhead costs are incurred by Agent 5's double-LLM consensus (940.5 ms / 51.1%) and Agent 6's LocalStack Docker sandbox execution (760.8 ms / 41.3%). These modules consume 92.4% of overall execution time. This is the overhead incurred for thorough verification within the scope of real-time feedback.</w:t>
+      </w:r>
+    </w:p>
+    <w:p>
+      <w:pPr>
+        <w:jc w:val="center"/>
+      </w:pPr>
+    </w:p>
+    <w:p>
+      <w:r>
+        <w:drawing>
+          <wp:inline xmlns:a="http://schemas.openxmlformats.org/drawingml/2006/main" xmlns:pic="http://schemas.openxmlformats.org/drawingml/2006/picture">
+            <wp:extent cx="3017520" cy="1419593"/>
+            <wp:docPr id="2" name="Picture 2"/>
+            <wp:cNvGraphicFramePr>
+              <a:graphicFrameLocks noChangeAspect="1"/>
+            </wp:cNvGraphicFramePr>
+            <a:graphic>
+              <a:graphicData uri="http://schemas.openxmlformats.org/drawingml/2006/picture">
+                <pic:pic>
+                  <pic:nvPicPr>
+                    <pic:cNvPr id="0" name="fig_vulnerability_benchmark.png"/>
+                    <pic:cNvPicPr/>
+                  </pic:nvPicPr>
+                  <pic:blipFill>
+                    <a:blip r:embed="rId10"/>
+                    <a:stretch>
+                      <a:fillRect/>
+                    </a:stretch>
+                  </pic:blipFill>
+                  <pic:spPr>
+                    <a:xfrm>
+                      <a:off x="0" y="0"/>
+                      <a:ext cx="3017520" cy="1419593"/>
+                    </a:xfrm>
+                    <a:prstGeom prst="rect"/>
+                  </pic:spPr>
+                </pic:pic>
+              </a:graphicData>
+            </a:graphic>
+          </wp:inline>
+        </w:drawing>
+      </w:r>
+    </w:p>
+    <w:p>
+      <w:pPr>
+        <w:jc w:val="center"/>
+      </w:pPr>
+      <w:r>
+        <w:rPr>
+          <w:rFonts w:ascii="Times New Roman" w:hAnsi="Times New Roman"/>
+          <w:i/>
+          <w:sz w:val="15"/>
+        </w:rPr>
+        <w:t>Fig. 2. Comparative Vulnerability Detection Performance Across 2,450 Templates.</w:t>
+      </w:r>
+    </w:p>
+    <w:p>
+      <w:pPr>
+        <w:jc w:val="center"/>
+      </w:pPr>
+    </w:p>
+    <w:p>
+      <w:r>
+        <w:drawing>
+          <wp:inline xmlns:a="http://schemas.openxmlformats.org/drawingml/2006/main" xmlns:pic="http://schemas.openxmlformats.org/drawingml/2006/picture">
+            <wp:extent cx="3017520" cy="1336553"/>
+            <wp:docPr id="3" name="Picture 3"/>
+            <wp:cNvGraphicFramePr>
+              <a:graphicFrameLocks noChangeAspect="1"/>
+            </wp:cNvGraphicFramePr>
+            <a:graphic>
+              <a:graphicData uri="http://schemas.openxmlformats.org/drawingml/2006/picture">
+                <pic:pic>
+                  <pic:nvPicPr>
+                    <pic:cNvPr id="0" name="fig_secret_and_remediation.png"/>
+                    <pic:cNvPicPr/>
+                  </pic:nvPicPr>
+                  <pic:blipFill>
+                    <a:blip r:embed="rId11"/>
+                    <a:stretch>
+                      <a:fillRect/>
+                    </a:stretch>
+                  </pic:blipFill>
+                  <pic:spPr>
+                    <a:xfrm>
+                      <a:off x="0" y="0"/>
+                      <a:ext cx="3017520" cy="1336553"/>
+                    </a:xfrm>
+                    <a:prstGeom prst="rect"/>
+                  </pic:spPr>
+                </pic:pic>
+              </a:graphicData>
+            </a:graphic>
+          </wp:inline>
+        </w:drawing>
+      </w:r>
+    </w:p>
+    <w:p>
+      <w:pPr>
+        <w:jc w:val="center"/>
+      </w:pPr>
+      <w:r>
+        <w:rPr>
+          <w:rFonts w:ascii="Times New Roman" w:hAnsi="Times New Roman"/>
+          <w:i/>
+          <w:sz w:val="15"/>
+        </w:rPr>
+        <w:t>Fig. 3. Secret Detection &amp; Sandbox Remediation Pass Rates.</w:t>
+      </w:r>
+    </w:p>
+    <w:p>
+      <w:pPr>
+        <w:jc w:val="center"/>
+      </w:pPr>
+    </w:p>
+    <w:p>
+      <w:r>
+        <w:drawing>
+          <wp:inline xmlns:a="http://schemas.openxmlformats.org/drawingml/2006/main" xmlns:pic="http://schemas.openxmlformats.org/drawingml/2006/picture">
+            <wp:extent cx="3017520" cy="1311905"/>
+            <wp:docPr id="4" name="Picture 4"/>
+            <wp:cNvGraphicFramePr>
+              <a:graphicFrameLocks noChangeAspect="1"/>
+            </wp:cNvGraphicFramePr>
+            <a:graphic>
+              <a:graphicData uri="http://schemas.openxmlformats.org/drawingml/2006/picture">
+                <pic:pic>
+                  <pic:nvPicPr>
+                    <pic:cNvPr id="0" name="fig_latency_breakdown.png"/>
+                    <pic:cNvPicPr/>
+                  </pic:nvPicPr>
+                  <pic:blipFill>
+                    <a:blip r:embed="rId12"/>
+                    <a:stretch>
+                      <a:fillRect/>
+                    </a:stretch>
+                  </pic:blipFill>
+                  <pic:spPr>
+                    <a:xfrm>
+                      <a:off x="0" y="0"/>
+                      <a:ext cx="3017520" cy="1311905"/>
+                    </a:xfrm>
+                    <a:prstGeom prst="rect"/>
+                  </pic:spPr>
+                </pic:pic>
+              </a:graphicData>
+            </a:graphic>
+          </wp:inline>
+        </w:drawing>
+      </w:r>
+    </w:p>
+    <w:p>
+      <w:pPr>
+        <w:jc w:val="center"/>
+      </w:pPr>
+      <w:r>
+        <w:rPr>
+          <w:rFonts w:ascii="Times New Roman" w:hAnsi="Times New Roman"/>
+          <w:i/>
+          <w:sz w:val="15"/>
+        </w:rPr>
+        <w:t>Fig. 4. Execution Latency Breakdown per Agent (Total: 1.84s).</w:t>
       </w:r>
     </w:p>
     <w:p>
@@ -806,7 +1038,7 @@
         <w:rPr>
           <w:rFonts w:ascii="Times New Roman" w:hAnsi="Times New Roman"/>
           <w:b/>
-          <w:sz w:val="24"/>
+          <w:sz w:val="22"/>
         </w:rPr>
         <w:t>VII. Case Studies &amp; Vulnerability Remediation</w:t>
       </w:r>
@@ -820,7 +1052,19 @@
           <w:rFonts w:ascii="Times New Roman" w:hAnsi="Times New Roman"/>
           <w:sz w:val="16"/>
         </w:rPr>
-        <w:t>Case Study 1 (S3 Hardening): Listing 1 illustrates the remediation of an Amazon S3 bucket with public ACLs and missing KMS encryption. AgentShield AI injects a public access block resource and configures server-side SSE-KMS encryption. Case Study 2 (IAM Least-Privilege): Listing 2 demonstrates scoping an over-privileged wildcard IAM policy (Action: *, Resource: *) down to exact DynamoDB read actions.</w:t>
+        <w:t>Case Study 1: S3 Bucket HardeningListing 1 shows an S3 bucket with a public-read-write ACL and no server-side encryption. The original configuration therefore allows public access and does not enable encryption for the bucket by default.The revised configuration removes the public ACL and adds an aws_s3_bucket_public_access_block resource. The four public-access controls are enabled, and server-side encryption is configured with AWS KMS. These changes bring the configuration into compliance with CIS AWS Benchmark v3.0 Control 2.1.1.</w:t>
+      </w:r>
+    </w:p>
+    <w:p>
+      <w:pPr>
+        <w:jc w:val="both"/>
+      </w:pPr>
+      <w:r>
+        <w:rPr>
+          <w:rFonts w:ascii="Times New Roman" w:hAnsi="Times New Roman"/>
+          <w:sz w:val="16"/>
+        </w:rPr>
+        <w:t>Case Study 2: IAM Policy Least-Privilege ScopingListing 2 contains an IAM policy with * in both the Action and Resource fields. In this form, the policy grants unrestricted actions on unrestricted resources.The updated policy narrows the permissions to dynamodb:GetItem and dynamodb:Query and limits access to the Orders table. The change replaces the two wildcard values with the specific permissions and resource shown in the listing.</w:t>
       </w:r>
     </w:p>
     <w:p>
@@ -831,7 +1075,7 @@
         <w:rPr>
           <w:rFonts w:ascii="Times New Roman" w:hAnsi="Times New Roman"/>
           <w:b/>
-          <w:sz w:val="24"/>
+          <w:sz w:val="22"/>
         </w:rPr>
         <w:t>VIII. Ablation Study &amp; Cost Analysis</w:t>
       </w:r>
@@ -845,7 +1089,73 @@
           <w:rFonts w:ascii="Times New Roman" w:hAnsi="Times New Roman"/>
           <w:sz w:val="16"/>
         </w:rPr>
-        <w:t>Table V confirms that removing Tree-sitter drops precision to 71.2%, omitting entropy reduces secret recall to 88.2%, and removing the LocalStack sandbox allows 18.4% broken patches. Table VI demonstrates a 99.99% MTTR reduction (24.6 days down to 1.84s) and a 98.7% reduction in false-alarm triage costs.</w:t>
+        <w:t>Component Ablation Analysis: Table V and Fig. 5(a) show the effect of disabling one architectural component at a time on 500 benchmark templates. The removal of the Tree-sitter AST parser takes precision down from 99.1% to 71.2% due to false positive triggers based on commented and inactive blocks. Turning off the Shannon entropy analysis brings down secret recall from 98.4% to 88.2%. Removing the CIS RAG engine based hybrid system causes the first-pass patch success rate to fall from 90.8% to 71.4% due to schema hallucinations and exclusion of the LocalStack sandboxing feature allows 18.4% syntactically incorrect patches to go undetected.</w:t>
+      </w:r>
+    </w:p>
+    <w:p>
+      <w:pPr>
+        <w:jc w:val="both"/>
+      </w:pPr>
+      <w:r>
+        <w:rPr>
+          <w:rFonts w:ascii="Times New Roman" w:hAnsi="Times New Roman"/>
+          <w:sz w:val="16"/>
+        </w:rPr>
+        <w:t>Enterprise cost and operational return on investment: Table VI and Fig. 5(b) estimate an improvement in operational enterprise DevSecOps flows. The agent shields AI provides a 99.99% reduction in Mean time to remediation falling from the industry standard baseline of 24.6 days down to 1.84s. Engineering cost associated with Triaging security tickets is improved by 99.68% from 160 hours to 0.5 hours per 1,000 files. Monthly cost of monthly security alarms is reduced by 98.70% from 14.5 K to 120 dollars, with no blockage to pipeline releases</w:t>
+      </w:r>
+    </w:p>
+    <w:p>
+      <w:pPr>
+        <w:jc w:val="center"/>
+      </w:pPr>
+    </w:p>
+    <w:p>
+      <w:r>
+        <w:drawing>
+          <wp:inline xmlns:a="http://schemas.openxmlformats.org/drawingml/2006/main" xmlns:pic="http://schemas.openxmlformats.org/drawingml/2006/picture">
+            <wp:extent cx="3017520" cy="1334047"/>
+            <wp:docPr id="5" name="Picture 5"/>
+            <wp:cNvGraphicFramePr>
+              <a:graphicFrameLocks noChangeAspect="1"/>
+            </wp:cNvGraphicFramePr>
+            <a:graphic>
+              <a:graphicData uri="http://schemas.openxmlformats.org/drawingml/2006/picture">
+                <pic:pic>
+                  <pic:nvPicPr>
+                    <pic:cNvPr id="0" name="fig_ablation_and_impact.png"/>
+                    <pic:cNvPicPr/>
+                  </pic:nvPicPr>
+                  <pic:blipFill>
+                    <a:blip r:embed="rId13"/>
+                    <a:stretch>
+                      <a:fillRect/>
+                    </a:stretch>
+                  </pic:blipFill>
+                  <pic:spPr>
+                    <a:xfrm>
+                      <a:off x="0" y="0"/>
+                      <a:ext cx="3017520" cy="1334047"/>
+                    </a:xfrm>
+                    <a:prstGeom prst="rect"/>
+                  </pic:spPr>
+                </pic:pic>
+              </a:graphicData>
+            </a:graphic>
+          </wp:inline>
+        </w:drawing>
+      </w:r>
+    </w:p>
+    <w:p>
+      <w:pPr>
+        <w:jc w:val="center"/>
+      </w:pPr>
+      <w:r>
+        <w:rPr>
+          <w:rFonts w:ascii="Times New Roman" w:hAnsi="Times New Roman"/>
+          <w:i/>
+          <w:sz w:val="15"/>
+        </w:rPr>
+        <w:t>Fig. 5. Component Ablation and Enterprise MTTR/Cost Reduction ROI.</w:t>
       </w:r>
     </w:p>
     <w:p>
@@ -856,7 +1166,7 @@
         <w:rPr>
           <w:rFonts w:ascii="Times New Roman" w:hAnsi="Times New Roman"/>
           <w:b/>
-          <w:sz w:val="24"/>
+          <w:sz w:val="22"/>
         </w:rPr>
         <w:t>IX. Conclusion &amp; Future Scope</w:t>
       </w:r>
@@ -870,7 +1180,7 @@
           <w:rFonts w:ascii="Times New Roman" w:hAnsi="Times New Roman"/>
           <w:sz w:val="16"/>
         </w:rPr>
-        <w:t>AgentShield AI provides an autonomous, closed-loop multi-agent framework for zero-shot IaC security auditing, secret interception, and sandbox-validated remediation. By uniting Tree-sitter CST parsing, Shannon entropy filtering, hybrid dense-sparse RAG, dual-LLM consensus, and LocalStack Docker validation, it delivers 99.1% precision and 97.8% first-pass fix success in 1.84s. Future work includes live runtime drift remediation via eBPF kernel telemetry and self-hosted SLM deployment.</w:t>
+        <w:t>AgentShield AI provides an autonomous multi-agent framework for zero-shot IaC security auditing, secret interception, and deterministic sandbox-validated remediation. By integrating Tree-sitter AST parsing, Shannon entropy filtering, hybrid dense-sparse RAG, dual-LLM consensus, and LocalStack execution sandboxing, the system achieves 99.1% precision, 98.4% recall, and 97.8% first-pass patch success in 1.84 seconds. Future work will investigate autonomous runtime drift remediation via eBPF kernel telemetry and knowledge distillation into fine-tuned edge Small Language Models (SLMs).</w:t>
       </w:r>
     </w:p>
     <w:p>
@@ -4597,7 +4907,7 @@
         <w:rPr>
           <w:rFonts w:ascii="Times New Roman" w:hAnsi="Times New Roman"/>
           <w:b/>
-          <w:sz w:val="24"/>
+          <w:sz w:val="22"/>
         </w:rPr>
         <w:t>Reference</w:t>
       </w:r>
@@ -4609,9 +4919,9 @@
       <w:r>
         <w:rPr>
           <w:rFonts w:ascii="Times New Roman" w:hAnsi="Times New Roman"/>
-          <w:sz w:val="15"/>
+          <w:sz w:val="14"/>
         </w:rPr>
-        <w:t>[1] Y. Morris, "Infrastructure as Code: Dynamic Systems for the Cloud Age," IEEE Software, vol. 38, no. 1, pp. 64–72, Jan. 2021.</w:t>
+        <w:t>[1] Y. Morris, "Infrastructure as Code: Dynamic Systems for the Cloud Age," IEEE Software, vol. 38, no. 1, pp. 64-72, Jan. 2021.</w:t>
       </w:r>
     </w:p>
     <w:p>
@@ -4621,9 +4931,9 @@
       <w:r>
         <w:rPr>
           <w:rFonts w:ascii="Times New Roman" w:hAnsi="Times New Roman"/>
-          <w:sz w:val="15"/>
+          <w:sz w:val="14"/>
         </w:rPr>
-        <w:t>[2] A. Guerriero, M. Cito, and M. Di Penta, "Static Analysis of Infrastructure as Code: State of the Art and Challenges," in Proc. IEEE/ACM ICSE, 2023, pp. 1120–1132.</w:t>
+        <w:t>[2] A. Guerriero, M. Cito, and M. Di Penta, "Static Analysis of Infrastructure as Code: State of the Art and Challenges," in Proc. IEEE/ACM ICSE, 2023, pp. 1120-1132.</w:t>
       </w:r>
     </w:p>
     <w:p>
@@ -4633,9 +4943,9 @@
       <w:r>
         <w:rPr>
           <w:rFonts w:ascii="Times New Roman" w:hAnsi="Times New Roman"/>
-          <w:sz w:val="15"/>
+          <w:sz w:val="14"/>
         </w:rPr>
-        <w:t>[3] F. Rahman, R. Mahdavi-Hezaveh, and L. Williams, "What Are the Threats to Infrastructure as Code?," IEEE Trans. Softw. Eng., vol. 49, no. 4, pp. 1650–1668, Apr. 2023.</w:t>
+        <w:t>[3] F. Rahman, R. Mahdavi-Hezaveh, and L. Williams, "What Are the Threats to Infrastructure as Code?," IEEE Trans. Softw. Eng., vol. 49, no. 4, pp. 1650-1668, Apr. 2023.</w:t>
       </w:r>
     </w:p>
     <w:p>
@@ -4645,7 +4955,7 @@
       <w:r>
         <w:rPr>
           <w:rFonts w:ascii="Times New Roman" w:hAnsi="Times New Roman"/>
-          <w:sz w:val="15"/>
+          <w:sz w:val="14"/>
         </w:rPr>
         <w:t>[4] Unit 42, "Palo Alto Networks Cloud Threat Report: Attack Surface in IaC," Tech. Rep., 2024.</w:t>
       </w:r>
@@ -4657,7 +4967,7 @@
       <w:r>
         <w:rPr>
           <w:rFonts w:ascii="Times New Roman" w:hAnsi="Times New Roman"/>
-          <w:sz w:val="15"/>
+          <w:sz w:val="14"/>
         </w:rPr>
         <w:t>[5] Datadog Security Labs, "State of Cloud Security: Secrets and IAM Misconfigurations," Industry Rep., 2024.</w:t>
       </w:r>
@@ -4669,7 +4979,7 @@
       <w:r>
         <w:rPr>
           <w:rFonts w:ascii="Times New Roman" w:hAnsi="Times New Roman"/>
-          <w:sz w:val="15"/>
+          <w:sz w:val="14"/>
         </w:rPr>
         <w:t>[6] Bridgecrew, "Checkov: Static Code Analysis for Infrastructure as Code," https://github.com/bridgecrewio/checkov, 2024.</w:t>
       </w:r>
@@ -4681,7 +4991,7 @@
       <w:r>
         <w:rPr>
           <w:rFonts w:ascii="Times New Roman" w:hAnsi="Times New Roman"/>
-          <w:sz w:val="15"/>
+          <w:sz w:val="14"/>
         </w:rPr>
         <w:t>[7] Aquasecurity, "tfsec: Security Scanner for Terraform Code," https://github.com/aquasecurity/tfsec, 2023.</w:t>
       </w:r>
@@ -4693,9 +5003,9 @@
       <w:r>
         <w:rPr>
           <w:rFonts w:ascii="Times New Roman" w:hAnsi="Times New Roman"/>
-          <w:sz w:val="15"/>
+          <w:sz w:val="14"/>
         </w:rPr>
-        <w:t>[8] Checkmarx, "KICS: Keeping Infrastructure as Code Secure," in Proc. IEEE SecDev, 2022, pp. 88–95.</w:t>
+        <w:t>[8] Checkmarx, "KICS: Keeping Infrastructure as Code Secure," in Proc. IEEE SecDev, 2022, pp. 88-95.</w:t>
       </w:r>
     </w:p>
     <w:p>
@@ -4705,7 +5015,7 @@
       <w:r>
         <w:rPr>
           <w:rFonts w:ascii="Times New Roman" w:hAnsi="Times New Roman"/>
-          <w:sz w:val="15"/>
+          <w:sz w:val="14"/>
         </w:rPr>
         <w:t>[9] Aqua Security, "Trivy: Security Scanner for Containers and IaC," https://github.com/aquasecurity/trivy, 2024.</w:t>
       </w:r>
@@ -4717,9 +5027,9 @@
       <w:r>
         <w:rPr>
           <w:rFonts w:ascii="Times New Roman" w:hAnsi="Times New Roman"/>
-          <w:sz w:val="15"/>
+          <w:sz w:val="14"/>
         </w:rPr>
-        <w:t>[10] C. Kumara and I. Sommerville, "Evaluating Static Security Analysis on IaC," in Proc. IEEE ICSSA, 2022, pp. 45–54.</w:t>
+        <w:t>[10] C. Kumara and I. Sommerville, "Evaluating Static Security Analysis on IaC," in Proc. IEEE ICSSA, 2022, pp. 45-54.</w:t>
       </w:r>
     </w:p>
     <w:p>
@@ -4729,9 +5039,9 @@
       <w:r>
         <w:rPr>
           <w:rFonts w:ascii="Times New Roman" w:hAnsi="Times New Roman"/>
-          <w:sz w:val="15"/>
+          <w:sz w:val="14"/>
         </w:rPr>
-        <w:t>[11] N. Borovits, Y. Gil, and E. Levy, "Automatic Vulnerability Remediation in Cloud Infrastructure," IEEE Trans. Serv. Comput., vol. 16, no. 3, pp. 1824–1837, May 2023.</w:t>
+        <w:t>[11] N. Borovits, Y. Gil, and E. Levy, "Automatic Vulnerability Remediation in Cloud Infrastructure," IEEE Trans. Serv. Comput., vol. 16, no. 3, pp. 1824-1837, May 2023.</w:t>
       </w:r>
     </w:p>
     <w:p>
@@ -4741,9 +5051,9 @@
       <w:r>
         <w:rPr>
           <w:rFonts w:ascii="Times New Roman" w:hAnsi="Times New Roman"/>
-          <w:sz w:val="15"/>
+          <w:sz w:val="14"/>
         </w:rPr>
-        <w:t>[12] S. Pearce et al., "Examining Zero-Shot Vulnerability Repair with Large Language Models," in Proc. IEEE S&amp;P, 2023, pp. 2339–2356.</w:t>
+        <w:t>[12] S. Pearce et al., "Examining Zero-Shot Vulnerability Repair with Large Language Models," in Proc. IEEE S&amp;P, 2023, pp. 2339-2356.</w:t>
       </w:r>
     </w:p>
     <w:p>
@@ -4753,9 +5063,9 @@
       <w:r>
         <w:rPr>
           <w:rFonts w:ascii="Times New Roman" w:hAnsi="Times New Roman"/>
-          <w:sz w:val="15"/>
+          <w:sz w:val="14"/>
         </w:rPr>
-        <w:t>[13] M. Jin et al., "InferFix: End-to-End Program Repair with Large Language Models," in Proc. ACM FSE, 2023, pp. 1642–1654.</w:t>
+        <w:t>[13] M. Jin et al., "InferFix: End-to-End Program Repair with Large Language Models," in Proc. ACM FSE, 2023, pp. 1642-1654.</w:t>
       </w:r>
     </w:p>
     <w:p>
@@ -4765,9 +5075,9 @@
       <w:r>
         <w:rPr>
           <w:rFonts w:ascii="Times New Roman" w:hAnsi="Times New Roman"/>
-          <w:sz w:val="15"/>
+          <w:sz w:val="14"/>
         </w:rPr>
-        <w:t>[14] C. E. Shannon, "A Mathematical Theory of Communication," Bell System Technical Journal, vol. 27, no. 3, pp. 379–423, Jul. 1948.</w:t>
+        <w:t>[14] C. E. Shannon, "A Mathematical Theory of Communication," Bell System Technical Journal, vol. 27, no. 3, pp. 379-423, Jul. 1948.</w:t>
       </w:r>
     </w:p>
     <w:p>
@@ -4777,7 +5087,7 @@
       <w:r>
         <w:rPr>
           <w:rFonts w:ascii="Times New Roman" w:hAnsi="Times New Roman"/>
-          <w:sz w:val="15"/>
+          <w:sz w:val="14"/>
         </w:rPr>
         <w:t>[15] Center for Internet Security, "CIS Amazon Web Services Foundations Benchmark v3.0.0," Dec. 2023.</w:t>
       </w:r>
@@ -4789,7 +5099,7 @@
       <w:r>
         <w:rPr>
           <w:rFonts w:ascii="Times New Roman" w:hAnsi="Times New Roman"/>
-          <w:sz w:val="15"/>
+          <w:sz w:val="14"/>
         </w:rPr>
         <w:t>[16] LocalStack Authors, "LocalStack: A Fully Functional Local Cloud Stack," https://github.com/localstack/localstack, 2024.</w:t>
       </w:r>
@@ -4801,9 +5111,9 @@
       <w:r>
         <w:rPr>
           <w:rFonts w:ascii="Times New Roman" w:hAnsi="Times New Roman"/>
-          <w:sz w:val="15"/>
+          <w:sz w:val="14"/>
         </w:rPr>
-        <w:t>[17] N. Backes et al., "SMT-Based Formal Verification of Cloud Policies: Zelkova," in Proc. CAV, Springer, 2018, pp. 623–640.</w:t>
+        <w:t>[17] N. Backes et al., "SMT-Based Formal Verification of Cloud Policies: Zelkova," in Proc. CAV, Springer, 2018, pp. 623-640.</w:t>
       </w:r>
     </w:p>
     <w:p>
@@ -4813,9 +5123,9 @@
       <w:r>
         <w:rPr>
           <w:rFonts w:ascii="Times New Roman" w:hAnsi="Times New Roman"/>
-          <w:sz w:val="15"/>
+          <w:sz w:val="14"/>
         </w:rPr>
-        <w:t>[18] D. Song, H. Zhang, and X. Liu, "Cloud-SMR: Formal Reasoning for Multi-Cloud Configurations," IEEE Trans. Cloud Comput., vol. 11, no. 2, pp. 1420–1435, Apr. 2023.</w:t>
+        <w:t>[18] D. Song, H. Zhang, and X. Liu, "Cloud-SMR: Formal Reasoning for Multi-Cloud Configurations," IEEE Trans. Cloud Comput., vol. 11, no. 2, pp. 1420-1435, Apr. 2023.</w:t>
       </w:r>
     </w:p>
     <w:p>
@@ -4825,7 +5135,7 @@
       <w:r>
         <w:rPr>
           <w:rFonts w:ascii="Times New Roman" w:hAnsi="Times New Roman"/>
-          <w:sz w:val="15"/>
+          <w:sz w:val="14"/>
         </w:rPr>
         <w:t>[19] Z. Rice, "Gitleaks: Protect and Discover Secrets in Code," https://github.com/gitleaks/gitleaks, 2024.</w:t>
       </w:r>
@@ -4837,7 +5147,7 @@
       <w:r>
         <w:rPr>
           <w:rFonts w:ascii="Times New Roman" w:hAnsi="Times New Roman"/>
-          <w:sz w:val="15"/>
+          <w:sz w:val="14"/>
         </w:rPr>
         <w:t>[20] Truffle Security, "TruffleHog: Find Credentials Deep in Git Repositories," 2024.</w:t>
       </w:r>
@@ -4849,9 +5159,9 @@
       <w:r>
         <w:rPr>
           <w:rFonts w:ascii="Times New Roman" w:hAnsi="Times New Roman"/>
-          <w:sz w:val="15"/>
+          <w:sz w:val="14"/>
         </w:rPr>
-        <w:t>[21] N. Toprani and V. Madisetti, "Automated IaC Security Framework Using Graph-Theoretic Dependency Analysis and LLMs," IEEE Access, vol. 13, pp. 18240–18258, Jan. 2025.</w:t>
+        <w:t>[21] N. Toprani and V. Madisetti, "Automated IaC Security Framework Using Graph-Theoretic Dependency Analysis and LLMs," IEEE Access, vol. 13, pp. 18240-18258, Jan. 2025.</w:t>
       </w:r>
     </w:p>
     <w:p>
@@ -4861,7 +5171,7 @@
       <w:r>
         <w:rPr>
           <w:rFonts w:ascii="Times New Roman" w:hAnsi="Times New Roman"/>
-          <w:sz w:val="15"/>
+          <w:sz w:val="14"/>
         </w:rPr>
         <w:t>[22] M. Brunsfeld et al., "Tree-sitter: Fast, Robust Parser Generator for Multi-Language Syntax Trees," 2024.</w:t>
       </w:r>
@@ -4873,9 +5183,9 @@
       <w:r>
         <w:rPr>
           <w:rFonts w:ascii="Times New Roman" w:hAnsi="Times New Roman"/>
-          <w:sz w:val="15"/>
+          <w:sz w:val="14"/>
         </w:rPr>
-        <w:t>[23] P. Lewis et al., "Retrieval-Augmented Generation for Knowledge-Intensive NLP Tasks," in NeurIPS, 2020, pp. 9459–9474.</w:t>
+        <w:t>[23] P. Lewis et al., "Retrieval-Augmented Generation for Knowledge-Intensive NLP Tasks," in NeurIPS, 2020, pp. 9459-9474.</w:t>
       </w:r>
     </w:p>
     <w:p>
@@ -4885,9 +5195,9 @@
       <w:r>
         <w:rPr>
           <w:rFonts w:ascii="Times New Roman" w:hAnsi="Times New Roman"/>
-          <w:sz w:val="15"/>
+          <w:sz w:val="14"/>
         </w:rPr>
-        <w:t>[24] H. Joshi, J. Sanchez, and K. Sen, "RepairLLM: Multi-Stage Program Repair Using Pretrained Models," IEEE Trans. Softw. Eng., vol. 50, no. 2, pp. 312–329, 2024.</w:t>
+        <w:t>[24] H. Joshi, J. Sanchez, and K. Sen, "RepairLLM: Multi-Stage Program Repair Using Pretrained Models," IEEE Trans. Softw. Eng., vol. 50, no. 2, pp. 312-329, 2024.</w:t>
       </w:r>
     </w:p>
     <w:sectPr>

</xml_diff>